<commit_message>
dos módulos en la interfaz
</commit_message>
<xml_diff>
--- a/proyecto bases.docx
+++ b/proyecto bases.docx
@@ -76,31 +76,7 @@
           <w:sz w:val="36"/>
           <w:szCs w:val="36"/>
         </w:rPr>
-        <w:t>Bases de datos</w:t>
-      </w:r>
-      <w:r>
-        <w:rPr>
-          <w:rFonts w:ascii="Arial" w:hAnsi="Arial" w:cs="Arial"/>
-          <w:sz w:val="36"/>
-          <w:szCs w:val="36"/>
-        </w:rPr>
-        <w:t xml:space="preserve"> </w:t>
-      </w:r>
-      <w:r>
-        <w:rPr>
-          <w:rFonts w:ascii="Arial" w:hAnsi="Arial" w:cs="Arial"/>
-          <w:sz w:val="36"/>
-          <w:szCs w:val="36"/>
-        </w:rPr>
-        <w:t>-</w:t>
-      </w:r>
-      <w:r>
-        <w:rPr>
-          <w:rFonts w:ascii="Arial" w:hAnsi="Arial" w:cs="Arial"/>
-          <w:sz w:val="36"/>
-          <w:szCs w:val="36"/>
-        </w:rPr>
-        <w:t xml:space="preserve"> Primer proyecto </w:t>
+        <w:t xml:space="preserve">Bases de datos - Primer proyecto </w:t>
       </w:r>
     </w:p>
     <w:p>
@@ -260,47 +236,7 @@
           <w:sz w:val="36"/>
           <w:szCs w:val="36"/>
         </w:rPr>
-        <w:t>15</w:t>
-      </w:r>
-      <w:r>
-        <w:rPr>
-          <w:rFonts w:ascii="Arial" w:hAnsi="Arial" w:cs="Arial"/>
-          <w:sz w:val="36"/>
-          <w:szCs w:val="36"/>
-        </w:rPr>
-        <w:t>/</w:t>
-      </w:r>
-      <w:r>
-        <w:rPr>
-          <w:rFonts w:ascii="Arial" w:hAnsi="Arial" w:cs="Arial"/>
-          <w:sz w:val="36"/>
-          <w:szCs w:val="36"/>
-        </w:rPr>
-        <w:t>9</w:t>
-      </w:r>
-      <w:r>
-        <w:rPr>
-          <w:rFonts w:ascii="Arial" w:hAnsi="Arial" w:cs="Arial"/>
-          <w:sz w:val="36"/>
-          <w:szCs w:val="36"/>
-        </w:rPr>
-        <w:t>/2</w:t>
-      </w:r>
-      <w:r>
-        <w:rPr>
-          <w:rFonts w:ascii="Arial" w:hAnsi="Arial" w:cs="Arial"/>
-          <w:sz w:val="36"/>
-          <w:szCs w:val="36"/>
-        </w:rPr>
-        <w:t>02</w:t>
-      </w:r>
-      <w:r>
-        <w:rPr>
-          <w:rFonts w:ascii="Arial" w:hAnsi="Arial" w:cs="Arial"/>
-          <w:sz w:val="36"/>
-          <w:szCs w:val="36"/>
-        </w:rPr>
-        <w:t>6</w:t>
+        <w:t>15/9/2026</w:t>
       </w:r>
     </w:p>
     <w:p>
@@ -538,19 +474,7 @@
               <w:rPr>
                 <w:rFonts w:ascii="Arial" w:hAnsi="Arial" w:cs="Arial"/>
               </w:rPr>
-              <w:t xml:space="preserve">, nombre, </w:t>
-            </w:r>
-            <w:r>
-              <w:rPr>
-                <w:rFonts w:ascii="Arial" w:hAnsi="Arial" w:cs="Arial"/>
-              </w:rPr>
-              <w:t>dirección</w:t>
-            </w:r>
-            <w:r>
-              <w:rPr>
-                <w:rFonts w:ascii="Arial" w:hAnsi="Arial" w:cs="Arial"/>
-              </w:rPr>
-              <w:t>, ciudad, capacidad)</w:t>
+              <w:t>, nombre, dirección, ciudad, capacidad)</w:t>
             </w:r>
           </w:p>
         </w:tc>
@@ -2766,74 +2690,27 @@
     <w:p/>
     <w:p/>
     <w:p/>
+    <w:p>
+      <w:pPr>
+        <w:pStyle w:val="Subttulo"/>
+      </w:pPr>
+      <w:r>
+        <w:lastRenderedPageBreak/>
+        <w:t xml:space="preserve">Modelo conceptual ampliado </w:t>
+      </w:r>
+    </w:p>
     <w:p/>
-    <w:p/>
-    <w:p/>
-    <w:p/>
-    <w:p/>
-    <w:p/>
-    <w:p/>
-    <w:p/>
-    <w:p/>
-    <w:p/>
-    <w:p/>
-    <w:p/>
-    <w:p/>
-    <w:p/>
-    <w:p/>
-    <w:p/>
-    <w:p/>
-    <w:p/>
-    <w:p>
-      <w:pPr>
-        <w:pStyle w:val="Subttulo"/>
-      </w:pPr>
-      <w:r>
-        <w:t xml:space="preserve">Modelo conceptual ampliado </w:t>
-      </w:r>
-    </w:p>
-    <w:p/>
-    <w:p>
-      <w:pPr>
-        <w:rPr>
-          <w:rFonts w:ascii="Arial" w:hAnsi="Arial" w:cs="Arial"/>
-        </w:rPr>
-      </w:pPr>
-      <w:r>
-        <w:rPr>
-          <w:rFonts w:ascii="Arial" w:hAnsi="Arial" w:cs="Arial"/>
-        </w:rPr>
-        <w:t>Cabe recalcar que se eligieron los módulos de gestión de ubicaciones (</w:t>
-      </w:r>
-      <w:r>
-        <w:rPr>
-          <w:rFonts w:ascii="Arial" w:hAnsi="Arial" w:cs="Arial"/>
-        </w:rPr>
-        <w:t>RF-08 a RF-10</w:t>
-      </w:r>
-      <w:r>
-        <w:rPr>
-          <w:rFonts w:ascii="Arial" w:hAnsi="Arial" w:cs="Arial"/>
-        </w:rPr>
-        <w:t xml:space="preserve">), el módulo de tareas asociadas a ventos </w:t>
-      </w:r>
-      <w:r>
-        <w:rPr>
-          <w:rFonts w:ascii="Arial" w:hAnsi="Arial" w:cs="Arial"/>
-        </w:rPr>
-        <w:t>(RF-15 a RF-17)</w:t>
-      </w:r>
-      <w:r>
-        <w:rPr>
-          <w:rFonts w:ascii="Arial" w:hAnsi="Arial" w:cs="Arial"/>
-        </w:rPr>
-        <w:t xml:space="preserve">, y el módulo de disponibilidad de usuarios y gestión de tiempos </w:t>
-      </w:r>
-      <w:r>
-        <w:rPr>
-          <w:rFonts w:ascii="Arial" w:hAnsi="Arial" w:cs="Arial"/>
-        </w:rPr>
-        <w:t>(RF-11 y RF-12)</w:t>
+    <w:p>
+      <w:pPr>
+        <w:rPr>
+          <w:rFonts w:ascii="Arial" w:hAnsi="Arial" w:cs="Arial"/>
+        </w:rPr>
+      </w:pPr>
+      <w:r>
+        <w:rPr>
+          <w:rFonts w:ascii="Arial" w:hAnsi="Arial" w:cs="Arial"/>
+        </w:rPr>
+        <w:t>Cabe recalcar que se eligieron los módulos de gestión de ubicaciones (RF-08 a RF-10), el módulo de tareas asociadas a ventos (RF-15 a RF-17), y el módulo de disponibilidad de usuarios y gestión de tiempos (RF-11 y RF-12)</w:t>
       </w:r>
       <w:r>
         <w:rPr>
@@ -2878,6 +2755,7 @@
       <w:r>
         <w:rPr>
           <w:rFonts w:ascii="Arial" w:hAnsi="Arial" w:cs="Arial"/>
+          <w:noProof/>
         </w:rPr>
         <w:drawing>
           <wp:anchor distT="0" distB="0" distL="114300" distR="114300" simplePos="0" relativeHeight="251658240" behindDoc="0" locked="0" layoutInCell="1" allowOverlap="1" wp14:anchorId="5270D6BA" wp14:editId="4CC6F764">
@@ -3025,7 +2903,6 @@
         <w:pStyle w:val="Prrafodelista"/>
         <w:rPr>
           <w:rFonts w:ascii="Arial" w:hAnsi="Arial" w:cs="Arial"/>
-          <w:lang w:val="pt-PT"/>
         </w:rPr>
       </w:pPr>
     </w:p>
@@ -3034,7 +2911,6 @@
         <w:pStyle w:val="Prrafodelista"/>
         <w:rPr>
           <w:rFonts w:ascii="Arial" w:hAnsi="Arial" w:cs="Arial"/>
-          <w:lang w:val="pt-PT"/>
         </w:rPr>
       </w:pPr>
     </w:p>
@@ -3043,7 +2919,6 @@
         <w:pStyle w:val="Prrafodelista"/>
         <w:rPr>
           <w:rFonts w:ascii="Arial" w:hAnsi="Arial" w:cs="Arial"/>
-          <w:lang w:val="pt-PT"/>
         </w:rPr>
       </w:pPr>
     </w:p>
@@ -3052,7 +2927,6 @@
         <w:pStyle w:val="Prrafodelista"/>
         <w:rPr>
           <w:rFonts w:ascii="Arial" w:hAnsi="Arial" w:cs="Arial"/>
-          <w:lang w:val="pt-PT"/>
         </w:rPr>
       </w:pPr>
     </w:p>
@@ -3061,7 +2935,6 @@
         <w:pStyle w:val="Prrafodelista"/>
         <w:rPr>
           <w:rFonts w:ascii="Arial" w:hAnsi="Arial" w:cs="Arial"/>
-          <w:lang w:val="pt-PT"/>
         </w:rPr>
       </w:pPr>
     </w:p>
@@ -3070,7 +2943,6 @@
         <w:pStyle w:val="Prrafodelista"/>
         <w:rPr>
           <w:rFonts w:ascii="Arial" w:hAnsi="Arial" w:cs="Arial"/>
-          <w:lang w:val="pt-PT"/>
         </w:rPr>
       </w:pPr>
     </w:p>
@@ -3079,7 +2951,6 @@
         <w:pStyle w:val="Prrafodelista"/>
         <w:rPr>
           <w:rFonts w:ascii="Arial" w:hAnsi="Arial" w:cs="Arial"/>
-          <w:lang w:val="pt-PT"/>
         </w:rPr>
       </w:pPr>
     </w:p>
@@ -3088,7 +2959,6 @@
         <w:pStyle w:val="Prrafodelista"/>
         <w:rPr>
           <w:rFonts w:ascii="Arial" w:hAnsi="Arial" w:cs="Arial"/>
-          <w:lang w:val="pt-PT"/>
         </w:rPr>
       </w:pPr>
     </w:p>
@@ -3097,7 +2967,6 @@
         <w:pStyle w:val="Prrafodelista"/>
         <w:rPr>
           <w:rFonts w:ascii="Arial" w:hAnsi="Arial" w:cs="Arial"/>
-          <w:lang w:val="pt-PT"/>
         </w:rPr>
       </w:pPr>
     </w:p>
@@ -3106,7 +2975,6 @@
         <w:pStyle w:val="Prrafodelista"/>
         <w:rPr>
           <w:rFonts w:ascii="Arial" w:hAnsi="Arial" w:cs="Arial"/>
-          <w:lang w:val="pt-PT"/>
         </w:rPr>
       </w:pPr>
     </w:p>
@@ -3115,7 +2983,6 @@
         <w:pStyle w:val="Prrafodelista"/>
         <w:rPr>
           <w:rFonts w:ascii="Arial" w:hAnsi="Arial" w:cs="Arial"/>
-          <w:lang w:val="pt-PT"/>
         </w:rPr>
       </w:pPr>
     </w:p>
@@ -3124,7 +2991,6 @@
         <w:pStyle w:val="Prrafodelista"/>
         <w:rPr>
           <w:rFonts w:ascii="Arial" w:hAnsi="Arial" w:cs="Arial"/>
-          <w:lang w:val="pt-PT"/>
         </w:rPr>
       </w:pPr>
     </w:p>
@@ -3133,7 +2999,6 @@
         <w:pStyle w:val="Prrafodelista"/>
         <w:rPr>
           <w:rFonts w:ascii="Arial" w:hAnsi="Arial" w:cs="Arial"/>
-          <w:lang w:val="pt-PT"/>
         </w:rPr>
       </w:pPr>
     </w:p>
@@ -3142,7 +3007,6 @@
         <w:pStyle w:val="Prrafodelista"/>
         <w:rPr>
           <w:rFonts w:ascii="Arial" w:hAnsi="Arial" w:cs="Arial"/>
-          <w:lang w:val="pt-PT"/>
         </w:rPr>
       </w:pPr>
     </w:p>
@@ -3151,7 +3015,6 @@
         <w:pStyle w:val="Prrafodelista"/>
         <w:rPr>
           <w:rFonts w:ascii="Arial" w:hAnsi="Arial" w:cs="Arial"/>
-          <w:lang w:val="pt-PT"/>
         </w:rPr>
       </w:pPr>
     </w:p>
@@ -3160,7 +3023,6 @@
         <w:pStyle w:val="Prrafodelista"/>
         <w:rPr>
           <w:rFonts w:ascii="Arial" w:hAnsi="Arial" w:cs="Arial"/>
-          <w:lang w:val="pt-PT"/>
         </w:rPr>
       </w:pPr>
     </w:p>
@@ -3169,7 +3031,6 @@
         <w:pStyle w:val="Prrafodelista"/>
         <w:rPr>
           <w:rFonts w:ascii="Arial" w:hAnsi="Arial" w:cs="Arial"/>
-          <w:lang w:val="pt-PT"/>
         </w:rPr>
       </w:pPr>
     </w:p>
@@ -3190,6 +3051,7 @@
           <w:rFonts w:ascii="Arial" w:hAnsi="Arial" w:cs="Arial"/>
           <w:lang w:val="pt-PT"/>
         </w:rPr>
+        <w:lastRenderedPageBreak/>
         <w:t xml:space="preserve">Modelo de tareas asociadas a </w:t>
       </w:r>
       <w:r>
@@ -3233,33 +3095,25 @@
           <w:lang w:val="pt-PT"/>
         </w:rPr>
       </w:pPr>
-    </w:p>
-    <w:p>
-      <w:pPr>
-        <w:pStyle w:val="Prrafodelista"/>
-        <w:rPr>
-          <w:rFonts w:ascii="Arial" w:hAnsi="Arial" w:cs="Arial"/>
+      <w:r>
+        <w:rPr>
+          <w:rFonts w:ascii="Arial" w:hAnsi="Arial" w:cs="Arial"/>
+          <w:noProof/>
           <w:lang w:val="pt-PT"/>
         </w:rPr>
-      </w:pPr>
-      <w:r>
-        <w:rPr>
-          <w:rFonts w:ascii="Arial" w:hAnsi="Arial" w:cs="Arial"/>
-          <w:lang w:val="pt-PT"/>
-        </w:rPr>
         <w:drawing>
-          <wp:anchor distT="0" distB="0" distL="114300" distR="114300" simplePos="0" relativeHeight="251659264" behindDoc="0" locked="0" layoutInCell="1" allowOverlap="1" wp14:anchorId="72D993FD" wp14:editId="63FB0669">
+          <wp:anchor distT="0" distB="0" distL="114300" distR="114300" simplePos="0" relativeHeight="251661312" behindDoc="0" locked="0" layoutInCell="1" allowOverlap="1" wp14:anchorId="36FEA4A2" wp14:editId="6BC56C9E">
             <wp:simplePos x="0" y="0"/>
             <wp:positionH relativeFrom="margin">
-              <wp:posOffset>130241</wp:posOffset>
+              <wp:align>left</wp:align>
             </wp:positionH>
             <wp:positionV relativeFrom="paragraph">
-              <wp:posOffset>118729</wp:posOffset>
+              <wp:posOffset>160600</wp:posOffset>
             </wp:positionV>
-            <wp:extent cx="5692491" cy="5548860"/>
-            <wp:effectExtent l="0" t="0" r="3810" b="0"/>
+            <wp:extent cx="5966175" cy="5852090"/>
+            <wp:effectExtent l="0" t="0" r="0" b="0"/>
             <wp:wrapNone/>
-            <wp:docPr id="1960711079" name="Imagen 1"/>
+            <wp:docPr id="1891299498" name="Imagen 1"/>
             <wp:cNvGraphicFramePr>
               <a:graphicFrameLocks xmlns:a="http://schemas.openxmlformats.org/drawingml/2006/main" noChangeAspect="1"/>
             </wp:cNvGraphicFramePr>
@@ -3267,7 +3121,7 @@
               <a:graphicData uri="http://schemas.openxmlformats.org/drawingml/2006/picture">
                 <pic:pic xmlns:pic="http://schemas.openxmlformats.org/drawingml/2006/picture">
                   <pic:nvPicPr>
-                    <pic:cNvPr id="1960711079" name=""/>
+                    <pic:cNvPr id="1891299498" name=""/>
                     <pic:cNvPicPr/>
                   </pic:nvPicPr>
                   <pic:blipFill>
@@ -3285,7 +3139,7 @@
                   <pic:spPr>
                     <a:xfrm>
                       <a:off x="0" y="0"/>
-                      <a:ext cx="5692491" cy="5548860"/>
+                      <a:ext cx="5966175" cy="5852090"/>
                     </a:xfrm>
                     <a:prstGeom prst="rect">
                       <a:avLst/>
@@ -3378,7 +3232,6 @@
     </w:p>
     <w:p>
       <w:pPr>
-        <w:pStyle w:val="Prrafodelista"/>
         <w:rPr>
           <w:rFonts w:ascii="Arial" w:hAnsi="Arial" w:cs="Arial"/>
           <w:lang w:val="pt-PT"/>
@@ -3387,7 +3240,6 @@
     </w:p>
     <w:p>
       <w:pPr>
-        <w:pStyle w:val="Prrafodelista"/>
         <w:rPr>
           <w:rFonts w:ascii="Arial" w:hAnsi="Arial" w:cs="Arial"/>
           <w:lang w:val="pt-PT"/>
@@ -3396,7 +3248,6 @@
     </w:p>
     <w:p>
       <w:pPr>
-        <w:pStyle w:val="Prrafodelista"/>
         <w:rPr>
           <w:rFonts w:ascii="Arial" w:hAnsi="Arial" w:cs="Arial"/>
           <w:lang w:val="pt-PT"/>
@@ -3405,7 +3256,6 @@
     </w:p>
     <w:p>
       <w:pPr>
-        <w:pStyle w:val="Prrafodelista"/>
         <w:rPr>
           <w:rFonts w:ascii="Arial" w:hAnsi="Arial" w:cs="Arial"/>
           <w:lang w:val="pt-PT"/>
@@ -3414,7 +3264,6 @@
     </w:p>
     <w:p>
       <w:pPr>
-        <w:pStyle w:val="Prrafodelista"/>
         <w:rPr>
           <w:rFonts w:ascii="Arial" w:hAnsi="Arial" w:cs="Arial"/>
           <w:lang w:val="pt-PT"/>
@@ -3423,7 +3272,6 @@
     </w:p>
     <w:p>
       <w:pPr>
-        <w:pStyle w:val="Prrafodelista"/>
         <w:rPr>
           <w:rFonts w:ascii="Arial" w:hAnsi="Arial" w:cs="Arial"/>
           <w:lang w:val="pt-PT"/>
@@ -3432,7 +3280,6 @@
     </w:p>
     <w:p>
       <w:pPr>
-        <w:pStyle w:val="Prrafodelista"/>
         <w:rPr>
           <w:rFonts w:ascii="Arial" w:hAnsi="Arial" w:cs="Arial"/>
           <w:lang w:val="pt-PT"/>
@@ -3441,7 +3288,6 @@
     </w:p>
     <w:p>
       <w:pPr>
-        <w:pStyle w:val="Prrafodelista"/>
         <w:rPr>
           <w:rFonts w:ascii="Arial" w:hAnsi="Arial" w:cs="Arial"/>
           <w:lang w:val="pt-PT"/>
@@ -3450,7 +3296,6 @@
     </w:p>
     <w:p>
       <w:pPr>
-        <w:pStyle w:val="Prrafodelista"/>
         <w:rPr>
           <w:rFonts w:ascii="Arial" w:hAnsi="Arial" w:cs="Arial"/>
           <w:lang w:val="pt-PT"/>
@@ -3459,7 +3304,6 @@
     </w:p>
     <w:p>
       <w:pPr>
-        <w:pStyle w:val="Prrafodelista"/>
         <w:rPr>
           <w:rFonts w:ascii="Arial" w:hAnsi="Arial" w:cs="Arial"/>
           <w:lang w:val="pt-PT"/>
@@ -3468,7 +3312,6 @@
     </w:p>
     <w:p>
       <w:pPr>
-        <w:pStyle w:val="Prrafodelista"/>
         <w:rPr>
           <w:rFonts w:ascii="Arial" w:hAnsi="Arial" w:cs="Arial"/>
           <w:lang w:val="pt-PT"/>
@@ -3477,7 +3320,6 @@
     </w:p>
     <w:p>
       <w:pPr>
-        <w:pStyle w:val="Prrafodelista"/>
         <w:rPr>
           <w:rFonts w:ascii="Arial" w:hAnsi="Arial" w:cs="Arial"/>
           <w:lang w:val="pt-PT"/>
@@ -3486,7 +3328,6 @@
     </w:p>
     <w:p>
       <w:pPr>
-        <w:pStyle w:val="Prrafodelista"/>
         <w:rPr>
           <w:rFonts w:ascii="Arial" w:hAnsi="Arial" w:cs="Arial"/>
           <w:lang w:val="pt-PT"/>
@@ -3495,7 +3336,6 @@
     </w:p>
     <w:p>
       <w:pPr>
-        <w:pStyle w:val="Prrafodelista"/>
         <w:rPr>
           <w:rFonts w:ascii="Arial" w:hAnsi="Arial" w:cs="Arial"/>
           <w:lang w:val="pt-PT"/>
@@ -3504,7 +3344,6 @@
     </w:p>
     <w:p>
       <w:pPr>
-        <w:pStyle w:val="Prrafodelista"/>
         <w:rPr>
           <w:rFonts w:ascii="Arial" w:hAnsi="Arial" w:cs="Arial"/>
           <w:lang w:val="pt-PT"/>
@@ -3513,7 +3352,6 @@
     </w:p>
     <w:p>
       <w:pPr>
-        <w:pStyle w:val="Prrafodelista"/>
         <w:rPr>
           <w:rFonts w:ascii="Arial" w:hAnsi="Arial" w:cs="Arial"/>
           <w:lang w:val="pt-PT"/>
@@ -3522,7 +3360,6 @@
     </w:p>
     <w:p>
       <w:pPr>
-        <w:pStyle w:val="Prrafodelista"/>
         <w:rPr>
           <w:rFonts w:ascii="Arial" w:hAnsi="Arial" w:cs="Arial"/>
           <w:lang w:val="pt-PT"/>
@@ -3531,7 +3368,6 @@
     </w:p>
     <w:p>
       <w:pPr>
-        <w:pStyle w:val="Prrafodelista"/>
         <w:rPr>
           <w:rFonts w:ascii="Arial" w:hAnsi="Arial" w:cs="Arial"/>
           <w:lang w:val="pt-PT"/>
@@ -3540,7 +3376,6 @@
     </w:p>
     <w:p>
       <w:pPr>
-        <w:pStyle w:val="Prrafodelista"/>
         <w:rPr>
           <w:rFonts w:ascii="Arial" w:hAnsi="Arial" w:cs="Arial"/>
           <w:lang w:val="pt-PT"/>
@@ -3549,7 +3384,6 @@
     </w:p>
     <w:p>
       <w:pPr>
-        <w:pStyle w:val="Prrafodelista"/>
         <w:rPr>
           <w:rFonts w:ascii="Arial" w:hAnsi="Arial" w:cs="Arial"/>
           <w:lang w:val="pt-PT"/>
@@ -3558,115 +3392,6 @@
     </w:p>
     <w:p>
       <w:pPr>
-        <w:pStyle w:val="Prrafodelista"/>
-        <w:rPr>
-          <w:rFonts w:ascii="Arial" w:hAnsi="Arial" w:cs="Arial"/>
-          <w:lang w:val="pt-PT"/>
-        </w:rPr>
-      </w:pPr>
-    </w:p>
-    <w:p>
-      <w:pPr>
-        <w:pStyle w:val="Prrafodelista"/>
-        <w:rPr>
-          <w:rFonts w:ascii="Arial" w:hAnsi="Arial" w:cs="Arial"/>
-          <w:lang w:val="pt-PT"/>
-        </w:rPr>
-      </w:pPr>
-    </w:p>
-    <w:p>
-      <w:pPr>
-        <w:pStyle w:val="Prrafodelista"/>
-        <w:rPr>
-          <w:rFonts w:ascii="Arial" w:hAnsi="Arial" w:cs="Arial"/>
-          <w:lang w:val="pt-PT"/>
-        </w:rPr>
-      </w:pPr>
-    </w:p>
-    <w:p>
-      <w:pPr>
-        <w:pStyle w:val="Prrafodelista"/>
-        <w:rPr>
-          <w:rFonts w:ascii="Arial" w:hAnsi="Arial" w:cs="Arial"/>
-          <w:lang w:val="pt-PT"/>
-        </w:rPr>
-      </w:pPr>
-    </w:p>
-    <w:p>
-      <w:pPr>
-        <w:pStyle w:val="Prrafodelista"/>
-        <w:rPr>
-          <w:rFonts w:ascii="Arial" w:hAnsi="Arial" w:cs="Arial"/>
-          <w:lang w:val="pt-PT"/>
-        </w:rPr>
-      </w:pPr>
-    </w:p>
-    <w:p>
-      <w:pPr>
-        <w:pStyle w:val="Prrafodelista"/>
-        <w:rPr>
-          <w:rFonts w:ascii="Arial" w:hAnsi="Arial" w:cs="Arial"/>
-          <w:lang w:val="pt-PT"/>
-        </w:rPr>
-      </w:pPr>
-    </w:p>
-    <w:p>
-      <w:pPr>
-        <w:pStyle w:val="Prrafodelista"/>
-        <w:rPr>
-          <w:rFonts w:ascii="Arial" w:hAnsi="Arial" w:cs="Arial"/>
-          <w:lang w:val="pt-PT"/>
-        </w:rPr>
-      </w:pPr>
-    </w:p>
-    <w:p>
-      <w:pPr>
-        <w:pStyle w:val="Prrafodelista"/>
-        <w:rPr>
-          <w:rFonts w:ascii="Arial" w:hAnsi="Arial" w:cs="Arial"/>
-          <w:lang w:val="pt-PT"/>
-        </w:rPr>
-      </w:pPr>
-    </w:p>
-    <w:p>
-      <w:pPr>
-        <w:pStyle w:val="Prrafodelista"/>
-        <w:rPr>
-          <w:rFonts w:ascii="Arial" w:hAnsi="Arial" w:cs="Arial"/>
-          <w:lang w:val="pt-PT"/>
-        </w:rPr>
-      </w:pPr>
-    </w:p>
-    <w:p>
-      <w:pPr>
-        <w:pStyle w:val="Prrafodelista"/>
-        <w:rPr>
-          <w:rFonts w:ascii="Arial" w:hAnsi="Arial" w:cs="Arial"/>
-          <w:lang w:val="pt-PT"/>
-        </w:rPr>
-      </w:pPr>
-    </w:p>
-    <w:p>
-      <w:pPr>
-        <w:pStyle w:val="Prrafodelista"/>
-        <w:rPr>
-          <w:rFonts w:ascii="Arial" w:hAnsi="Arial" w:cs="Arial"/>
-          <w:lang w:val="pt-PT"/>
-        </w:rPr>
-      </w:pPr>
-    </w:p>
-    <w:p>
-      <w:pPr>
-        <w:pStyle w:val="Prrafodelista"/>
-        <w:rPr>
-          <w:rFonts w:ascii="Arial" w:hAnsi="Arial" w:cs="Arial"/>
-          <w:lang w:val="pt-PT"/>
-        </w:rPr>
-      </w:pPr>
-    </w:p>
-    <w:p>
-      <w:pPr>
-        <w:pStyle w:val="Prrafodelista"/>
         <w:rPr>
           <w:rFonts w:ascii="Arial" w:hAnsi="Arial" w:cs="Arial"/>
           <w:lang w:val="pt-PT"/>
@@ -3697,6 +3422,7 @@
         <w:rPr>
           <w:rFonts w:ascii="Arial" w:hAnsi="Arial" w:cs="Arial"/>
         </w:rPr>
+        <w:lastRenderedPageBreak/>
         <w:t xml:space="preserve">Modelo </w:t>
       </w:r>
       <w:r>
@@ -3728,15 +3454,16 @@
       <w:r>
         <w:rPr>
           <w:rFonts w:ascii="Arial" w:hAnsi="Arial" w:cs="Arial"/>
+          <w:noProof/>
         </w:rPr>
         <w:drawing>
-          <wp:anchor distT="0" distB="0" distL="114300" distR="114300" simplePos="0" relativeHeight="251660288" behindDoc="0" locked="0" layoutInCell="1" allowOverlap="1" wp14:anchorId="29110A07" wp14:editId="1E9CA7FF">
+          <wp:anchor distT="0" distB="0" distL="114300" distR="114300" simplePos="0" relativeHeight="251660288" behindDoc="0" locked="0" layoutInCell="1" allowOverlap="1" wp14:anchorId="29110A07" wp14:editId="3D842384">
             <wp:simplePos x="0" y="0"/>
             <wp:positionH relativeFrom="margin">
-              <wp:align>left</wp:align>
+              <wp:posOffset>32633</wp:posOffset>
             </wp:positionH>
             <wp:positionV relativeFrom="paragraph">
-              <wp:posOffset>106828</wp:posOffset>
+              <wp:posOffset>209080</wp:posOffset>
             </wp:positionV>
             <wp:extent cx="5902037" cy="6035040"/>
             <wp:effectExtent l="0" t="0" r="3810" b="3810"/>
@@ -3974,18 +3701,13 @@
           <w:rFonts w:ascii="Arial" w:hAnsi="Arial" w:cs="Arial"/>
         </w:rPr>
       </w:pPr>
-      <w:r>
-        <w:rPr>
-          <w:rFonts w:ascii="Arial" w:hAnsi="Arial" w:cs="Arial"/>
-        </w:rPr>
-        <w:t xml:space="preserve">           </w:t>
-      </w:r>
     </w:p>
     <w:p>
       <w:pPr>
         <w:pStyle w:val="Subttulo"/>
       </w:pPr>
       <w:r>
+        <w:lastRenderedPageBreak/>
         <w:t xml:space="preserve">Modelos lógicos ampliados </w:t>
       </w:r>
     </w:p>
@@ -4385,7 +4107,90 @@
       </w:r>
     </w:p>
     <w:p/>
-    <w:p/>
+    <w:p>
+      <w:r>
+        <w:rPr>
+          <w:noProof/>
+        </w:rPr>
+        <w:drawing>
+          <wp:inline distT="0" distB="0" distL="0" distR="0" wp14:anchorId="7134AF9B" wp14:editId="2634E099">
+            <wp:extent cx="4564049" cy="2303714"/>
+            <wp:effectExtent l="0" t="0" r="8255" b="1905"/>
+            <wp:docPr id="646946455" name="Imagen 1"/>
+            <wp:cNvGraphicFramePr>
+              <a:graphicFrameLocks xmlns:a="http://schemas.openxmlformats.org/drawingml/2006/main" noChangeAspect="1"/>
+            </wp:cNvGraphicFramePr>
+            <a:graphic xmlns:a="http://schemas.openxmlformats.org/drawingml/2006/main">
+              <a:graphicData uri="http://schemas.openxmlformats.org/drawingml/2006/picture">
+                <pic:pic xmlns:pic="http://schemas.openxmlformats.org/drawingml/2006/picture">
+                  <pic:nvPicPr>
+                    <pic:cNvPr id="646946455" name=""/>
+                    <pic:cNvPicPr/>
+                  </pic:nvPicPr>
+                  <pic:blipFill>
+                    <a:blip r:embed="rId9"/>
+                    <a:stretch>
+                      <a:fillRect/>
+                    </a:stretch>
+                  </pic:blipFill>
+                  <pic:spPr>
+                    <a:xfrm>
+                      <a:off x="0" y="0"/>
+                      <a:ext cx="4572414" cy="2307936"/>
+                    </a:xfrm>
+                    <a:prstGeom prst="rect">
+                      <a:avLst/>
+                    </a:prstGeom>
+                  </pic:spPr>
+                </pic:pic>
+              </a:graphicData>
+            </a:graphic>
+          </wp:inline>
+        </w:drawing>
+      </w:r>
+    </w:p>
+    <w:p>
+      <w:r>
+        <w:rPr>
+          <w:noProof/>
+        </w:rPr>
+        <w:drawing>
+          <wp:inline distT="0" distB="0" distL="0" distR="0" wp14:anchorId="42FC74F5" wp14:editId="71C10E9A">
+            <wp:extent cx="4667416" cy="2482106"/>
+            <wp:effectExtent l="0" t="0" r="0" b="0"/>
+            <wp:docPr id="1618260250" name="Imagen 1"/>
+            <wp:cNvGraphicFramePr>
+              <a:graphicFrameLocks xmlns:a="http://schemas.openxmlformats.org/drawingml/2006/main" noChangeAspect="1"/>
+            </wp:cNvGraphicFramePr>
+            <a:graphic xmlns:a="http://schemas.openxmlformats.org/drawingml/2006/main">
+              <a:graphicData uri="http://schemas.openxmlformats.org/drawingml/2006/picture">
+                <pic:pic xmlns:pic="http://schemas.openxmlformats.org/drawingml/2006/picture">
+                  <pic:nvPicPr>
+                    <pic:cNvPr id="1618260250" name=""/>
+                    <pic:cNvPicPr/>
+                  </pic:nvPicPr>
+                  <pic:blipFill>
+                    <a:blip r:embed="rId10"/>
+                    <a:stretch>
+                      <a:fillRect/>
+                    </a:stretch>
+                  </pic:blipFill>
+                  <pic:spPr>
+                    <a:xfrm>
+                      <a:off x="0" y="0"/>
+                      <a:ext cx="4673801" cy="2485502"/>
+                    </a:xfrm>
+                    <a:prstGeom prst="rect">
+                      <a:avLst/>
+                    </a:prstGeom>
+                  </pic:spPr>
+                </pic:pic>
+              </a:graphicData>
+            </a:graphic>
+          </wp:inline>
+        </w:drawing>
+      </w:r>
+    </w:p>
     <w:p>
       <w:pPr>
         <w:rPr>
@@ -4395,33 +4200,6 @@
     </w:p>
     <w:p/>
     <w:p/>
-    <w:p/>
-    <w:p/>
-    <w:p/>
-    <w:p/>
-    <w:p/>
-    <w:p/>
-    <w:p/>
-    <w:p/>
-    <w:p/>
-    <w:p/>
-    <w:p/>
-    <w:p/>
-    <w:p/>
-    <w:p/>
-    <w:p/>
-    <w:p/>
-    <w:p/>
-    <w:p/>
-    <w:p/>
-    <w:p>
-      <w:pPr>
-        <w:pStyle w:val="Subttulo"/>
-      </w:pPr>
-      <w:r>
-        <w:t xml:space="preserve">Modelo lógico ampliado </w:t>
-      </w:r>
-    </w:p>
     <w:p/>
     <w:p/>
     <w:sectPr>
@@ -5159,6 +4937,7 @@
   <w:style w:type="character" w:default="1" w:styleId="Fuentedeprrafopredeter">
     <w:name w:val="Default Paragraph Font"/>
     <w:uiPriority w:val="1"/>
+    <w:semiHidden/>
     <w:unhideWhenUsed/>
   </w:style>
   <w:style w:type="table" w:default="1" w:styleId="Tablanormal">

</xml_diff>

<commit_message>
inalización del documento escrito, evidencias y correcciones
</commit_message>
<xml_diff>
--- a/proyecto bases.docx
+++ b/proyecto bases.docx
@@ -25,7 +25,7 @@
                     </pic:cNvPicPr>
                   </pic:nvPicPr>
                   <pic:blipFill rotWithShape="1">
-                    <a:blip r:embed="rId5"/>
+                    <a:blip r:embed="rId7"/>
                     <a:srcRect l="1" r="2507"/>
                     <a:stretch/>
                   </pic:blipFill>
@@ -318,7 +318,6 @@
                 <w:bCs/>
               </w:rPr>
             </w:pPr>
-            <w:proofErr w:type="spellStart"/>
             <w:r>
               <w:rPr>
                 <w:rFonts w:ascii="Arial" w:hAnsi="Arial" w:cs="Arial"/>
@@ -327,7 +326,6 @@
               </w:rPr>
               <w:t>Req</w:t>
             </w:r>
-            <w:proofErr w:type="spellEnd"/>
           </w:p>
         </w:tc>
         <w:tc>
@@ -460,21 +458,7 @@
               <w:rPr>
                 <w:rFonts w:ascii="Arial" w:hAnsi="Arial" w:cs="Arial"/>
               </w:rPr>
-              <w:t>Definir la entidad Ubicaciones y sus atributos (</w:t>
-            </w:r>
-            <w:proofErr w:type="spellStart"/>
-            <w:r>
-              <w:rPr>
-                <w:rFonts w:ascii="Arial" w:hAnsi="Arial" w:cs="Arial"/>
-              </w:rPr>
-              <w:t>id_ubicacion</w:t>
-            </w:r>
-            <w:proofErr w:type="spellEnd"/>
-            <w:r>
-              <w:rPr>
-                <w:rFonts w:ascii="Arial" w:hAnsi="Arial" w:cs="Arial"/>
-              </w:rPr>
-              <w:t>, nombre, dirección, ciudad, capacidad)</w:t>
+              <w:t>Definir la entidad Ubicaciones y sus atributos (id_ubicacion, nombre, dirección, ciudad, capacidad)</w:t>
             </w:r>
           </w:p>
         </w:tc>
@@ -740,7 +724,7 @@
               <w:rPr>
                 <w:rFonts w:ascii="Arial" w:hAnsi="Arial" w:cs="Arial"/>
               </w:rPr>
-              <w:t>Pendiente</w:t>
+              <w:t>Completado</w:t>
             </w:r>
           </w:p>
         </w:tc>
@@ -884,21 +868,7 @@
               <w:rPr>
                 <w:rFonts w:ascii="Arial" w:hAnsi="Arial" w:cs="Arial"/>
               </w:rPr>
-              <w:t xml:space="preserve">Incorporar </w:t>
-            </w:r>
-            <w:proofErr w:type="spellStart"/>
-            <w:r>
-              <w:rPr>
-                <w:rFonts w:ascii="Arial" w:hAnsi="Arial" w:cs="Arial"/>
-              </w:rPr>
-              <w:t>id_ubicacion</w:t>
-            </w:r>
-            <w:proofErr w:type="spellEnd"/>
-            <w:r>
-              <w:rPr>
-                <w:rFonts w:ascii="Arial" w:hAnsi="Arial" w:cs="Arial"/>
-              </w:rPr>
-              <w:t xml:space="preserve"> como FK en Eventos</w:t>
+              <w:t>Incorporar id_ubicacion como FK en Eventos</w:t>
             </w:r>
           </w:p>
         </w:tc>
@@ -980,35 +950,27 @@
               <w:rPr>
                 <w:rFonts w:ascii="Arial" w:hAnsi="Arial" w:cs="Arial"/>
               </w:rPr>
-              <w:t xml:space="preserve">Ejecutar ALTER TABLE eventos ADD COLUMN </w:t>
-            </w:r>
-            <w:proofErr w:type="spellStart"/>
-            <w:r>
-              <w:rPr>
-                <w:rFonts w:ascii="Arial" w:hAnsi="Arial" w:cs="Arial"/>
-              </w:rPr>
-              <w:t>id_ubicacion</w:t>
-            </w:r>
-            <w:proofErr w:type="spellEnd"/>
-          </w:p>
-        </w:tc>
-        <w:tc>
-          <w:tcPr>
-            <w:tcW w:w="0" w:type="auto"/>
-            <w:hideMark/>
-          </w:tcPr>
-          <w:p>
-            <w:pPr>
-              <w:spacing w:after="160" w:line="259" w:lineRule="auto"/>
-              <w:rPr>
-                <w:rFonts w:ascii="Arial" w:hAnsi="Arial" w:cs="Arial"/>
-              </w:rPr>
-            </w:pPr>
-            <w:r>
-              <w:rPr>
-                <w:rFonts w:ascii="Arial" w:hAnsi="Arial" w:cs="Arial"/>
-              </w:rPr>
-              <w:t>Pendiente</w:t>
+              <w:t>Ejecutar ALTER TABLE eventos ADD COLUMN id_ubicacion</w:t>
+            </w:r>
+          </w:p>
+        </w:tc>
+        <w:tc>
+          <w:tcPr>
+            <w:tcW w:w="0" w:type="auto"/>
+            <w:hideMark/>
+          </w:tcPr>
+          <w:p>
+            <w:pPr>
+              <w:spacing w:after="160" w:line="259" w:lineRule="auto"/>
+              <w:rPr>
+                <w:rFonts w:ascii="Arial" w:hAnsi="Arial" w:cs="Arial"/>
+              </w:rPr>
+            </w:pPr>
+            <w:r>
+              <w:rPr>
+                <w:rFonts w:ascii="Arial" w:hAnsi="Arial" w:cs="Arial"/>
+              </w:rPr>
+              <w:t>Completado</w:t>
             </w:r>
           </w:p>
         </w:tc>
@@ -1090,7 +1052,7 @@
               <w:rPr>
                 <w:rFonts w:ascii="Arial" w:hAnsi="Arial" w:cs="Arial"/>
               </w:rPr>
-              <w:t>Pendiente</w:t>
+              <w:t>Completado</w:t>
             </w:r>
           </w:p>
         </w:tc>
@@ -1172,7 +1134,7 @@
               <w:rPr>
                 <w:rFonts w:ascii="Arial" w:hAnsi="Arial" w:cs="Arial"/>
               </w:rPr>
-              <w:t>Pendiente</w:t>
+              <w:t>Completado</w:t>
             </w:r>
           </w:p>
         </w:tc>
@@ -1254,7 +1216,7 @@
               <w:rPr>
                 <w:rFonts w:ascii="Arial" w:hAnsi="Arial" w:cs="Arial"/>
               </w:rPr>
-              <w:t>Pendiente</w:t>
+              <w:t>Completado</w:t>
             </w:r>
           </w:p>
         </w:tc>
@@ -1302,7 +1264,6 @@
                 <w:bCs/>
               </w:rPr>
             </w:pPr>
-            <w:proofErr w:type="spellStart"/>
             <w:r>
               <w:rPr>
                 <w:rFonts w:ascii="Arial" w:hAnsi="Arial" w:cs="Arial"/>
@@ -1311,7 +1272,6 @@
               </w:rPr>
               <w:t>Req</w:t>
             </w:r>
-            <w:proofErr w:type="spellEnd"/>
           </w:p>
         </w:tc>
         <w:tc>
@@ -1444,16 +1404,8 @@
               <w:rPr>
                 <w:rFonts w:ascii="Arial" w:hAnsi="Arial" w:cs="Arial"/>
               </w:rPr>
-              <w:t xml:space="preserve">Definir entidad Disponibilidades y catálogo </w:t>
-            </w:r>
-            <w:proofErr w:type="spellStart"/>
-            <w:r>
-              <w:rPr>
-                <w:rFonts w:ascii="Arial" w:hAnsi="Arial" w:cs="Arial"/>
-              </w:rPr>
-              <w:t>Tipos_disponibilidad</w:t>
-            </w:r>
-            <w:proofErr w:type="spellEnd"/>
+              <w:t>Definir entidad Disponibilidades y catálogo Tipos_disponibilidad</w:t>
+            </w:r>
           </w:p>
         </w:tc>
         <w:tc>
@@ -1616,16 +1568,8 @@
               <w:rPr>
                 <w:rFonts w:ascii="Arial" w:hAnsi="Arial" w:cs="Arial"/>
               </w:rPr>
-              <w:t xml:space="preserve">Codificar CREATE TABLE disponibilidades y </w:t>
-            </w:r>
-            <w:proofErr w:type="spellStart"/>
-            <w:r>
-              <w:rPr>
-                <w:rFonts w:ascii="Arial" w:hAnsi="Arial" w:cs="Arial"/>
-              </w:rPr>
-              <w:t>tipos_disponibilidad</w:t>
-            </w:r>
-            <w:proofErr w:type="spellEnd"/>
+              <w:t>Codificar CREATE TABLE disponibilidades y tipos_disponibilidad</w:t>
+            </w:r>
           </w:p>
         </w:tc>
         <w:tc>
@@ -1727,7 +1671,7 @@
               <w:rPr>
                 <w:rFonts w:ascii="Arial" w:hAnsi="Arial" w:cs="Arial"/>
               </w:rPr>
-              <w:t>Pendiente</w:t>
+              <w:t>Completado</w:t>
             </w:r>
           </w:p>
         </w:tc>
@@ -1809,7 +1753,7 @@
               <w:rPr>
                 <w:rFonts w:ascii="Arial" w:hAnsi="Arial" w:cs="Arial"/>
               </w:rPr>
-              <w:t>Pendiente</w:t>
+              <w:t>Completado</w:t>
             </w:r>
           </w:p>
         </w:tc>
@@ -1891,7 +1835,7 @@
               <w:rPr>
                 <w:rFonts w:ascii="Arial" w:hAnsi="Arial" w:cs="Arial"/>
               </w:rPr>
-              <w:t>Pendiente</w:t>
+              <w:t>Completado</w:t>
             </w:r>
           </w:p>
         </w:tc>
@@ -1939,7 +1883,6 @@
                 <w:bCs/>
               </w:rPr>
             </w:pPr>
-            <w:proofErr w:type="spellStart"/>
             <w:r>
               <w:rPr>
                 <w:rFonts w:ascii="Arial" w:hAnsi="Arial" w:cs="Arial"/>
@@ -1948,7 +1891,6 @@
               </w:rPr>
               <w:t>Req</w:t>
             </w:r>
-            <w:proofErr w:type="spellEnd"/>
           </w:p>
         </w:tc>
         <w:tc>
@@ -2347,7 +2289,7 @@
               <w:rPr>
                 <w:rFonts w:ascii="Arial" w:hAnsi="Arial" w:cs="Arial"/>
               </w:rPr>
-              <w:t>Pendiente</w:t>
+              <w:t>Completado</w:t>
             </w:r>
           </w:p>
         </w:tc>
@@ -2429,7 +2371,7 @@
               <w:rPr>
                 <w:rFonts w:ascii="Arial" w:hAnsi="Arial" w:cs="Arial"/>
               </w:rPr>
-              <w:t>Pendiente</w:t>
+              <w:t>Completado</w:t>
             </w:r>
           </w:p>
         </w:tc>
@@ -2511,7 +2453,7 @@
               <w:rPr>
                 <w:rFonts w:ascii="Arial" w:hAnsi="Arial" w:cs="Arial"/>
               </w:rPr>
-              <w:t>Pendiente</w:t>
+              <w:t>Completado</w:t>
             </w:r>
           </w:p>
         </w:tc>
@@ -2593,7 +2535,7 @@
               <w:rPr>
                 <w:rFonts w:ascii="Arial" w:hAnsi="Arial" w:cs="Arial"/>
               </w:rPr>
-              <w:t>Pendiente</w:t>
+              <w:t>Completado</w:t>
             </w:r>
           </w:p>
         </w:tc>
@@ -2675,7 +2617,7 @@
               <w:rPr>
                 <w:rFonts w:ascii="Arial" w:hAnsi="Arial" w:cs="Arial"/>
               </w:rPr>
-              <w:t>Pendiente</w:t>
+              <w:t>Completado</w:t>
             </w:r>
           </w:p>
         </w:tc>
@@ -2781,7 +2723,7 @@
                     <pic:cNvPicPr/>
                   </pic:nvPicPr>
                   <pic:blipFill>
-                    <a:blip r:embed="rId6">
+                    <a:blip r:embed="rId8">
                       <a:extLst>
                         <a:ext uri="{28A0092B-C50C-407E-A947-70E740481C1C}">
                           <a14:useLocalDpi xmlns:a14="http://schemas.microsoft.com/office/drawing/2010/main" val="0"/>
@@ -3125,7 +3067,7 @@
                     <pic:cNvPicPr/>
                   </pic:nvPicPr>
                   <pic:blipFill>
-                    <a:blip r:embed="rId7">
+                    <a:blip r:embed="rId9">
                       <a:extLst>
                         <a:ext uri="{28A0092B-C50C-407E-A947-70E740481C1C}">
                           <a14:useLocalDpi xmlns:a14="http://schemas.microsoft.com/office/drawing/2010/main" val="0"/>
@@ -3480,7 +3422,7 @@
                     <pic:cNvPicPr/>
                   </pic:nvPicPr>
                   <pic:blipFill>
-                    <a:blip r:embed="rId8">
+                    <a:blip r:embed="rId10">
                       <a:extLst>
                         <a:ext uri="{28A0092B-C50C-407E-A947-70E740481C1C}">
                           <a14:useLocalDpi xmlns:a14="http://schemas.microsoft.com/office/drawing/2010/main" val="0"/>
@@ -3727,35 +3669,7 @@
         <w:rPr>
           <w:rFonts w:ascii="Arial" w:hAnsi="Arial" w:cs="Arial"/>
         </w:rPr>
-        <w:t>UBICACIONES (</w:t>
-      </w:r>
-      <w:proofErr w:type="spellStart"/>
-      <w:r>
-        <w:rPr>
-          <w:rFonts w:ascii="Arial" w:hAnsi="Arial" w:cs="Arial"/>
-        </w:rPr>
-        <w:t>id_ubicacion</w:t>
-      </w:r>
-      <w:proofErr w:type="spellEnd"/>
-      <w:r>
-        <w:rPr>
-          <w:rFonts w:ascii="Arial" w:hAnsi="Arial" w:cs="Arial"/>
-        </w:rPr>
-        <w:t xml:space="preserve"> [PK], nombre, </w:t>
-      </w:r>
-      <w:proofErr w:type="spellStart"/>
-      <w:r>
-        <w:rPr>
-          <w:rFonts w:ascii="Arial" w:hAnsi="Arial" w:cs="Arial"/>
-        </w:rPr>
-        <w:t>direccion</w:t>
-      </w:r>
-      <w:proofErr w:type="spellEnd"/>
-      <w:r>
-        <w:rPr>
-          <w:rFonts w:ascii="Arial" w:hAnsi="Arial" w:cs="Arial"/>
-        </w:rPr>
-        <w:t>, ciudad, capacidad)</w:t>
+        <w:t>UBICACIONES (id_ubicacion [PK], nombre, direccion, ciudad, capacidad)</w:t>
       </w:r>
     </w:p>
     <w:p>
@@ -3773,105 +3687,7 @@
         <w:rPr>
           <w:rFonts w:ascii="Arial" w:hAnsi="Arial" w:cs="Arial"/>
         </w:rPr>
-        <w:t>EVENTOS (</w:t>
-      </w:r>
-      <w:proofErr w:type="spellStart"/>
-      <w:r>
-        <w:rPr>
-          <w:rFonts w:ascii="Arial" w:hAnsi="Arial" w:cs="Arial"/>
-        </w:rPr>
-        <w:t>id_evento</w:t>
-      </w:r>
-      <w:proofErr w:type="spellEnd"/>
-      <w:r>
-        <w:rPr>
-          <w:rFonts w:ascii="Arial" w:hAnsi="Arial" w:cs="Arial"/>
-        </w:rPr>
-        <w:t xml:space="preserve"> [PK], </w:t>
-      </w:r>
-      <w:proofErr w:type="spellStart"/>
-      <w:r>
-        <w:rPr>
-          <w:rFonts w:ascii="Arial" w:hAnsi="Arial" w:cs="Arial"/>
-        </w:rPr>
-        <w:t>id_usuario_propietario</w:t>
-      </w:r>
-      <w:proofErr w:type="spellEnd"/>
-      <w:r>
-        <w:rPr>
-          <w:rFonts w:ascii="Arial" w:hAnsi="Arial" w:cs="Arial"/>
-        </w:rPr>
-        <w:t xml:space="preserve"> [FK], </w:t>
-      </w:r>
-      <w:proofErr w:type="spellStart"/>
-      <w:r>
-        <w:rPr>
-          <w:rFonts w:ascii="Arial" w:hAnsi="Arial" w:cs="Arial"/>
-        </w:rPr>
-        <w:t>id_categoria</w:t>
-      </w:r>
-      <w:proofErr w:type="spellEnd"/>
-      <w:r>
-        <w:rPr>
-          <w:rFonts w:ascii="Arial" w:hAnsi="Arial" w:cs="Arial"/>
-        </w:rPr>
-        <w:t xml:space="preserve"> [FK], titulo, </w:t>
-      </w:r>
-      <w:proofErr w:type="spellStart"/>
-      <w:r>
-        <w:rPr>
-          <w:rFonts w:ascii="Arial" w:hAnsi="Arial" w:cs="Arial"/>
-        </w:rPr>
-        <w:t>descripcion</w:t>
-      </w:r>
-      <w:proofErr w:type="spellEnd"/>
-      <w:r>
-        <w:rPr>
-          <w:rFonts w:ascii="Arial" w:hAnsi="Arial" w:cs="Arial"/>
-        </w:rPr>
-        <w:t xml:space="preserve">, </w:t>
-      </w:r>
-      <w:proofErr w:type="spellStart"/>
-      <w:r>
-        <w:rPr>
-          <w:rFonts w:ascii="Arial" w:hAnsi="Arial" w:cs="Arial"/>
-        </w:rPr>
-        <w:t>fecha_inicio</w:t>
-      </w:r>
-      <w:proofErr w:type="spellEnd"/>
-      <w:r>
-        <w:rPr>
-          <w:rFonts w:ascii="Arial" w:hAnsi="Arial" w:cs="Arial"/>
-        </w:rPr>
-        <w:t xml:space="preserve">, </w:t>
-      </w:r>
-      <w:proofErr w:type="spellStart"/>
-      <w:r>
-        <w:rPr>
-          <w:rFonts w:ascii="Arial" w:hAnsi="Arial" w:cs="Arial"/>
-        </w:rPr>
-        <w:t>fecha_fin</w:t>
-      </w:r>
-      <w:proofErr w:type="spellEnd"/>
-      <w:r>
-        <w:rPr>
-          <w:rFonts w:ascii="Arial" w:hAnsi="Arial" w:cs="Arial"/>
-        </w:rPr>
-        <w:t xml:space="preserve">, </w:t>
-      </w:r>
-      <w:proofErr w:type="spellStart"/>
-      <w:r>
-        <w:rPr>
-          <w:rFonts w:ascii="Arial" w:hAnsi="Arial" w:cs="Arial"/>
-        </w:rPr>
-        <w:t>id_ubicacion</w:t>
-      </w:r>
-      <w:proofErr w:type="spellEnd"/>
-      <w:r>
-        <w:rPr>
-          <w:rFonts w:ascii="Arial" w:hAnsi="Arial" w:cs="Arial"/>
-        </w:rPr>
-        <w:t xml:space="preserve"> [FK] ← nuevo)</w:t>
+        <w:t>EVENTOS (id_evento [PK], id_usuario_propietario [FK], id_categoria [FK], titulo, descripcion, fecha_inicio, fecha_fin, id_ubicacion [FK] ← nuevo)</w:t>
       </w:r>
     </w:p>
     <w:p>
@@ -3889,21 +3705,7 @@
         <w:rPr>
           <w:rFonts w:ascii="Arial" w:hAnsi="Arial" w:cs="Arial"/>
         </w:rPr>
-        <w:t>TIPOS_DISPONIBILIDAD (</w:t>
-      </w:r>
-      <w:proofErr w:type="spellStart"/>
-      <w:r>
-        <w:rPr>
-          <w:rFonts w:ascii="Arial" w:hAnsi="Arial" w:cs="Arial"/>
-        </w:rPr>
-        <w:t>id_tipo</w:t>
-      </w:r>
-      <w:proofErr w:type="spellEnd"/>
-      <w:r>
-        <w:rPr>
-          <w:rFonts w:ascii="Arial" w:hAnsi="Arial" w:cs="Arial"/>
-        </w:rPr>
-        <w:t xml:space="preserve"> [PK], nombre)</w:t>
+        <w:t>TIPOS_DISPONIBILIDAD (id_tipo [PK], nombre)</w:t>
       </w:r>
     </w:p>
     <w:p>
@@ -3921,77 +3723,7 @@
         <w:rPr>
           <w:rFonts w:ascii="Arial" w:hAnsi="Arial" w:cs="Arial"/>
         </w:rPr>
-        <w:t>DISPONIBILIDADES (</w:t>
-      </w:r>
-      <w:proofErr w:type="spellStart"/>
-      <w:r>
-        <w:rPr>
-          <w:rFonts w:ascii="Arial" w:hAnsi="Arial" w:cs="Arial"/>
-        </w:rPr>
-        <w:t>id_disponibilidad</w:t>
-      </w:r>
-      <w:proofErr w:type="spellEnd"/>
-      <w:r>
-        <w:rPr>
-          <w:rFonts w:ascii="Arial" w:hAnsi="Arial" w:cs="Arial"/>
-        </w:rPr>
-        <w:t xml:space="preserve"> [PK], </w:t>
-      </w:r>
-      <w:proofErr w:type="spellStart"/>
-      <w:r>
-        <w:rPr>
-          <w:rFonts w:ascii="Arial" w:hAnsi="Arial" w:cs="Arial"/>
-        </w:rPr>
-        <w:t>id_usuario</w:t>
-      </w:r>
-      <w:proofErr w:type="spellEnd"/>
-      <w:r>
-        <w:rPr>
-          <w:rFonts w:ascii="Arial" w:hAnsi="Arial" w:cs="Arial"/>
-        </w:rPr>
-        <w:t xml:space="preserve"> [FK], fecha, </w:t>
-      </w:r>
-      <w:proofErr w:type="spellStart"/>
-      <w:r>
-        <w:rPr>
-          <w:rFonts w:ascii="Arial" w:hAnsi="Arial" w:cs="Arial"/>
-        </w:rPr>
-        <w:t>hora_inicio</w:t>
-      </w:r>
-      <w:proofErr w:type="spellEnd"/>
-      <w:r>
-        <w:rPr>
-          <w:rFonts w:ascii="Arial" w:hAnsi="Arial" w:cs="Arial"/>
-        </w:rPr>
-        <w:t xml:space="preserve">, </w:t>
-      </w:r>
-      <w:proofErr w:type="spellStart"/>
-      <w:r>
-        <w:rPr>
-          <w:rFonts w:ascii="Arial" w:hAnsi="Arial" w:cs="Arial"/>
-        </w:rPr>
-        <w:t>hora_fin</w:t>
-      </w:r>
-      <w:proofErr w:type="spellEnd"/>
-      <w:r>
-        <w:rPr>
-          <w:rFonts w:ascii="Arial" w:hAnsi="Arial" w:cs="Arial"/>
-        </w:rPr>
-        <w:t xml:space="preserve">, </w:t>
-      </w:r>
-      <w:proofErr w:type="spellStart"/>
-      <w:r>
-        <w:rPr>
-          <w:rFonts w:ascii="Arial" w:hAnsi="Arial" w:cs="Arial"/>
-        </w:rPr>
-        <w:t>id_tipo</w:t>
-      </w:r>
-      <w:proofErr w:type="spellEnd"/>
-      <w:r>
-        <w:rPr>
-          <w:rFonts w:ascii="Arial" w:hAnsi="Arial" w:cs="Arial"/>
-        </w:rPr>
-        <w:t xml:space="preserve"> [FK])</w:t>
+        <w:t>DISPONIBILIDADES (id_disponibilidad [PK], id_usuario [FK], fecha, hora_inicio, hora_fin, id_tipo [FK])</w:t>
       </w:r>
     </w:p>
     <w:p>
@@ -4009,77 +3741,7 @@
         <w:rPr>
           <w:rFonts w:ascii="Arial" w:hAnsi="Arial" w:cs="Arial"/>
         </w:rPr>
-        <w:t>TAREAS (</w:t>
-      </w:r>
-      <w:proofErr w:type="spellStart"/>
-      <w:r>
-        <w:rPr>
-          <w:rFonts w:ascii="Arial" w:hAnsi="Arial" w:cs="Arial"/>
-        </w:rPr>
-        <w:t>id_tarea</w:t>
-      </w:r>
-      <w:proofErr w:type="spellEnd"/>
-      <w:r>
-        <w:rPr>
-          <w:rFonts w:ascii="Arial" w:hAnsi="Arial" w:cs="Arial"/>
-        </w:rPr>
-        <w:t xml:space="preserve"> [PK], </w:t>
-      </w:r>
-      <w:proofErr w:type="spellStart"/>
-      <w:r>
-        <w:rPr>
-          <w:rFonts w:ascii="Arial" w:hAnsi="Arial" w:cs="Arial"/>
-        </w:rPr>
-        <w:t>id_evento</w:t>
-      </w:r>
-      <w:proofErr w:type="spellEnd"/>
-      <w:r>
-        <w:rPr>
-          <w:rFonts w:ascii="Arial" w:hAnsi="Arial" w:cs="Arial"/>
-        </w:rPr>
-        <w:t xml:space="preserve"> [FK], </w:t>
-      </w:r>
-      <w:proofErr w:type="spellStart"/>
-      <w:r>
-        <w:rPr>
-          <w:rFonts w:ascii="Arial" w:hAnsi="Arial" w:cs="Arial"/>
-        </w:rPr>
-        <w:t>id_usuario_responsable</w:t>
-      </w:r>
-      <w:proofErr w:type="spellEnd"/>
-      <w:r>
-        <w:rPr>
-          <w:rFonts w:ascii="Arial" w:hAnsi="Arial" w:cs="Arial"/>
-        </w:rPr>
-        <w:t xml:space="preserve"> [FK], titulo, </w:t>
-      </w:r>
-      <w:proofErr w:type="spellStart"/>
-      <w:r>
-        <w:rPr>
-          <w:rFonts w:ascii="Arial" w:hAnsi="Arial" w:cs="Arial"/>
-        </w:rPr>
-        <w:t>descripcion</w:t>
-      </w:r>
-      <w:proofErr w:type="spellEnd"/>
-      <w:r>
-        <w:rPr>
-          <w:rFonts w:ascii="Arial" w:hAnsi="Arial" w:cs="Arial"/>
-        </w:rPr>
-        <w:t xml:space="preserve">, prioridad, </w:t>
-      </w:r>
-      <w:proofErr w:type="spellStart"/>
-      <w:r>
-        <w:rPr>
-          <w:rFonts w:ascii="Arial" w:hAnsi="Arial" w:cs="Arial"/>
-        </w:rPr>
-        <w:t>fecha_limite</w:t>
-      </w:r>
-      <w:proofErr w:type="spellEnd"/>
-      <w:r>
-        <w:rPr>
-          <w:rFonts w:ascii="Arial" w:hAnsi="Arial" w:cs="Arial"/>
-        </w:rPr>
-        <w:t>, estado)</w:t>
+        <w:t>TAREAS (id_tarea [PK], id_evento [FK], id_usuario_responsable [FK], titulo, descripcion, prioridad, fecha_limite, estado)</w:t>
       </w:r>
     </w:p>
     <w:p>
@@ -4128,7 +3790,7 @@
                     <pic:cNvPicPr/>
                   </pic:nvPicPr>
                   <pic:blipFill>
-                    <a:blip r:embed="rId9"/>
+                    <a:blip r:embed="rId11"/>
                     <a:stretch>
                       <a:fillRect/>
                     </a:stretch>
@@ -4170,7 +3832,7 @@
                     <pic:cNvPicPr/>
                   </pic:nvPicPr>
                   <pic:blipFill>
-                    <a:blip r:embed="rId10"/>
+                    <a:blip r:embed="rId12"/>
                     <a:stretch>
                       <a:fillRect/>
                     </a:stretch>
@@ -4193,15 +3855,621 @@
     </w:p>
     <w:p>
       <w:pPr>
-        <w:rPr>
-          <w:rFonts w:ascii="Arial" w:hAnsi="Arial" w:cs="Arial"/>
-        </w:rPr>
-      </w:pPr>
+        <w:pStyle w:val="Subttulo"/>
+      </w:pPr>
+      <w:r>
+        <w:lastRenderedPageBreak/>
+        <w:t>Evidencias</w:t>
+      </w:r>
+      <w:r>
+        <w:t>:</w:t>
+      </w:r>
+    </w:p>
+    <w:p>
+      <w:pPr>
+        <w:pStyle w:val="Prrafodelista"/>
+        <w:numPr>
+          <w:ilvl w:val="0"/>
+          <w:numId w:val="3"/>
+        </w:numPr>
+      </w:pPr>
+      <w:r>
+        <w:t xml:space="preserve">Módulo de </w:t>
+      </w:r>
+      <w:r>
+        <w:t>Ubicaciones (</w:t>
+      </w:r>
+      <w:r>
+        <w:t>RF-08)</w:t>
+      </w:r>
+    </w:p>
+    <w:p>
+      <w:pPr>
+        <w:pStyle w:val="Prrafodelista"/>
+        <w:numPr>
+          <w:ilvl w:val="0"/>
+          <w:numId w:val="5"/>
+        </w:numPr>
+      </w:pPr>
+      <w:r>
+        <w:t>Esta pantalla sirve para manejar los lugares donde se hacen los eventos. Se puede ver todo en la tabla</w:t>
+      </w:r>
+      <w:r>
+        <w:t>,</w:t>
+      </w:r>
+      <w:r>
+        <w:t xml:space="preserve"> y a la derecha está el formulario para agregar, editar o borrar una ubicación.</w:t>
+      </w:r>
+    </w:p>
+    <w:p>
+      <w:r>
+        <w:rPr>
+          <w:noProof/>
+        </w:rPr>
+        <w:drawing>
+          <wp:inline distT="0" distB="0" distL="0" distR="0" wp14:anchorId="60D6C57D" wp14:editId="465BED82">
+            <wp:extent cx="5072380" cy="2849880"/>
+            <wp:effectExtent l="0" t="0" r="0" b="7620"/>
+            <wp:docPr id="1370388837" name="Imagen 1"/>
+            <wp:cNvGraphicFramePr>
+              <a:graphicFrameLocks xmlns:a="http://schemas.openxmlformats.org/drawingml/2006/main" noChangeAspect="1"/>
+            </wp:cNvGraphicFramePr>
+            <a:graphic xmlns:a="http://schemas.openxmlformats.org/drawingml/2006/main">
+              <a:graphicData uri="http://schemas.openxmlformats.org/drawingml/2006/picture">
+                <pic:pic xmlns:pic="http://schemas.openxmlformats.org/drawingml/2006/picture">
+                  <pic:nvPicPr>
+                    <pic:cNvPr id="1370388837" name=""/>
+                    <pic:cNvPicPr/>
+                  </pic:nvPicPr>
+                  <pic:blipFill>
+                    <a:blip r:embed="rId13" cstate="print">
+                      <a:extLst>
+                        <a:ext uri="{28A0092B-C50C-407E-A947-70E740481C1C}">
+                          <a14:useLocalDpi xmlns:a14="http://schemas.microsoft.com/office/drawing/2010/main" val="0"/>
+                        </a:ext>
+                      </a:extLst>
+                    </a:blip>
+                    <a:stretch>
+                      <a:fillRect/>
+                    </a:stretch>
+                  </pic:blipFill>
+                  <pic:spPr>
+                    <a:xfrm>
+                      <a:off x="0" y="0"/>
+                      <a:ext cx="5072380" cy="2849880"/>
+                    </a:xfrm>
+                    <a:prstGeom prst="rect">
+                      <a:avLst/>
+                    </a:prstGeom>
+                  </pic:spPr>
+                </pic:pic>
+              </a:graphicData>
+            </a:graphic>
+          </wp:inline>
+        </w:drawing>
+      </w:r>
+    </w:p>
+    <w:p/>
+    <w:p>
+      <w:pPr>
+        <w:pStyle w:val="Prrafodelista"/>
+        <w:numPr>
+          <w:ilvl w:val="0"/>
+          <w:numId w:val="3"/>
+        </w:numPr>
+      </w:pPr>
+      <w:r>
+        <w:t xml:space="preserve">Selector de ubicación </w:t>
+      </w:r>
+      <w:r>
+        <w:t>e</w:t>
+      </w:r>
+      <w:r>
+        <w:t>n</w:t>
+      </w:r>
+      <w:r>
+        <w:t xml:space="preserve"> </w:t>
+      </w:r>
+      <w:r>
+        <w:t>Eventos (RF-09):</w:t>
+      </w:r>
+    </w:p>
+    <w:p>
+      <w:pPr>
+        <w:pStyle w:val="Prrafodelista"/>
+        <w:numPr>
+          <w:ilvl w:val="0"/>
+          <w:numId w:val="4"/>
+        </w:numPr>
+      </w:pPr>
+      <w:r>
+        <w:t xml:space="preserve">Al formulario de Eventos </w:t>
+      </w:r>
+      <w:r>
+        <w:t>se</w:t>
+      </w:r>
+      <w:r>
+        <w:t xml:space="preserve"> </w:t>
+      </w:r>
+      <w:r>
+        <w:t>agregó</w:t>
+      </w:r>
+      <w:r>
+        <w:t xml:space="preserve"> un campo para elegir la ubicación del evento, conectado con la tabla nueva de ubicaciones.</w:t>
+      </w:r>
+    </w:p>
+    <w:p>
+      <w:r>
+        <w:rPr>
+          <w:noProof/>
+        </w:rPr>
+        <w:drawing>
+          <wp:inline distT="0" distB="0" distL="0" distR="0" wp14:anchorId="2EC79E74" wp14:editId="26EAB27E">
+            <wp:extent cx="4992645" cy="2627381"/>
+            <wp:effectExtent l="0" t="0" r="0" b="1905"/>
+            <wp:docPr id="457736748" name="Imagen 1"/>
+            <wp:cNvGraphicFramePr>
+              <a:graphicFrameLocks xmlns:a="http://schemas.openxmlformats.org/drawingml/2006/main" noChangeAspect="1"/>
+            </wp:cNvGraphicFramePr>
+            <a:graphic xmlns:a="http://schemas.openxmlformats.org/drawingml/2006/main">
+              <a:graphicData uri="http://schemas.openxmlformats.org/drawingml/2006/picture">
+                <pic:pic xmlns:pic="http://schemas.openxmlformats.org/drawingml/2006/picture">
+                  <pic:nvPicPr>
+                    <pic:cNvPr id="457736748" name=""/>
+                    <pic:cNvPicPr/>
+                  </pic:nvPicPr>
+                  <pic:blipFill>
+                    <a:blip r:embed="rId14"/>
+                    <a:stretch>
+                      <a:fillRect/>
+                    </a:stretch>
+                  </pic:blipFill>
+                  <pic:spPr>
+                    <a:xfrm>
+                      <a:off x="0" y="0"/>
+                      <a:ext cx="5007022" cy="2634947"/>
+                    </a:xfrm>
+                    <a:prstGeom prst="rect">
+                      <a:avLst/>
+                    </a:prstGeom>
+                  </pic:spPr>
+                </pic:pic>
+              </a:graphicData>
+            </a:graphic>
+          </wp:inline>
+        </w:drawing>
+      </w:r>
+    </w:p>
+    <w:p/>
+    <w:p/>
+    <w:p>
+      <w:pPr>
+        <w:pStyle w:val="Prrafodelista"/>
+        <w:numPr>
+          <w:ilvl w:val="0"/>
+          <w:numId w:val="3"/>
+        </w:numPr>
+      </w:pPr>
+      <w:r>
+        <w:t>Ranking de ubicaciones (RF-10):</w:t>
+      </w:r>
+    </w:p>
+    <w:p>
+      <w:pPr>
+        <w:pStyle w:val="Prrafodelista"/>
+        <w:numPr>
+          <w:ilvl w:val="0"/>
+          <w:numId w:val="4"/>
+        </w:numPr>
+      </w:pPr>
+      <w:r>
+        <w:t xml:space="preserve"> </w:t>
+      </w:r>
+      <w:r>
+        <w:t>Abajo en la pestaña de Ubicaciones hay una tabla que muestra cuáles lugares se usan más, contando cuántos eventos tiene cada uno. Es de solo lectura, se actualiza sola con los datos de la base.</w:t>
+      </w:r>
+    </w:p>
+    <w:p>
+      <w:pPr>
+        <w:pStyle w:val="Prrafodelista"/>
+      </w:pPr>
+    </w:p>
+    <w:p>
+      <w:pPr>
+        <w:pStyle w:val="Prrafodelista"/>
+      </w:pPr>
+      <w:r>
+        <w:rPr>
+          <w:noProof/>
+        </w:rPr>
+        <w:drawing>
+          <wp:inline distT="0" distB="0" distL="0" distR="0" wp14:anchorId="7D0B75A0" wp14:editId="58ED37DA">
+            <wp:extent cx="4810539" cy="2703003"/>
+            <wp:effectExtent l="0" t="0" r="0" b="2540"/>
+            <wp:docPr id="738313707" name="Imagen 1"/>
+            <wp:cNvGraphicFramePr>
+              <a:graphicFrameLocks xmlns:a="http://schemas.openxmlformats.org/drawingml/2006/main" noChangeAspect="1"/>
+            </wp:cNvGraphicFramePr>
+            <a:graphic xmlns:a="http://schemas.openxmlformats.org/drawingml/2006/main">
+              <a:graphicData uri="http://schemas.openxmlformats.org/drawingml/2006/picture">
+                <pic:pic xmlns:pic="http://schemas.openxmlformats.org/drawingml/2006/picture">
+                  <pic:nvPicPr>
+                    <pic:cNvPr id="738313707" name=""/>
+                    <pic:cNvPicPr/>
+                  </pic:nvPicPr>
+                  <pic:blipFill>
+                    <a:blip r:embed="rId15"/>
+                    <a:stretch>
+                      <a:fillRect/>
+                    </a:stretch>
+                  </pic:blipFill>
+                  <pic:spPr>
+                    <a:xfrm>
+                      <a:off x="0" y="0"/>
+                      <a:ext cx="4818839" cy="2707667"/>
+                    </a:xfrm>
+                    <a:prstGeom prst="rect">
+                      <a:avLst/>
+                    </a:prstGeom>
+                  </pic:spPr>
+                </pic:pic>
+              </a:graphicData>
+            </a:graphic>
+          </wp:inline>
+        </w:drawing>
+      </w:r>
+    </w:p>
+    <w:p>
+      <w:pPr>
+        <w:pStyle w:val="Prrafodelista"/>
+      </w:pPr>
+    </w:p>
+    <w:p>
+      <w:pPr>
+        <w:pStyle w:val="Prrafodelista"/>
+      </w:pPr>
+    </w:p>
+    <w:p>
+      <w:pPr>
+        <w:pStyle w:val="Prrafodelista"/>
+        <w:numPr>
+          <w:ilvl w:val="0"/>
+          <w:numId w:val="3"/>
+        </w:numPr>
+      </w:pPr>
+      <w:r>
+        <w:t>Módulo de Gestión de tareas</w:t>
+      </w:r>
+    </w:p>
+    <w:p>
+      <w:pPr>
+        <w:pStyle w:val="Prrafodelista"/>
+        <w:numPr>
+          <w:ilvl w:val="0"/>
+          <w:numId w:val="4"/>
+        </w:numPr>
+      </w:pPr>
+      <w:r>
+        <w:t>Esta pantalla es para las tareas de cada evento. Cada tarea va ligada a un evento y a la persona responsable, y tiene prioridad, fecha límite y un estado</w:t>
+      </w:r>
+      <w:r>
+        <w:t>, ya sea pendiente, en progreso, completada o cancelada.</w:t>
+      </w:r>
+    </w:p>
+    <w:p>
+      <w:pPr>
+        <w:ind w:left="708"/>
+      </w:pPr>
+      <w:r>
+        <w:drawing>
+          <wp:inline distT="0" distB="0" distL="0" distR="0" wp14:anchorId="2673AD91" wp14:editId="3C48081D">
+            <wp:extent cx="4965413" cy="2790025"/>
+            <wp:effectExtent l="0" t="0" r="6985" b="0"/>
+            <wp:docPr id="668539338" name="Imagen 1"/>
+            <wp:cNvGraphicFramePr>
+              <a:graphicFrameLocks xmlns:a="http://schemas.openxmlformats.org/drawingml/2006/main" noChangeAspect="1"/>
+            </wp:cNvGraphicFramePr>
+            <a:graphic xmlns:a="http://schemas.openxmlformats.org/drawingml/2006/main">
+              <a:graphicData uri="http://schemas.openxmlformats.org/drawingml/2006/picture">
+                <pic:pic xmlns:pic="http://schemas.openxmlformats.org/drawingml/2006/picture">
+                  <pic:nvPicPr>
+                    <pic:cNvPr id="668539338" name=""/>
+                    <pic:cNvPicPr/>
+                  </pic:nvPicPr>
+                  <pic:blipFill>
+                    <a:blip r:embed="rId16"/>
+                    <a:stretch>
+                      <a:fillRect/>
+                    </a:stretch>
+                  </pic:blipFill>
+                  <pic:spPr>
+                    <a:xfrm>
+                      <a:off x="0" y="0"/>
+                      <a:ext cx="4983170" cy="2800003"/>
+                    </a:xfrm>
+                    <a:prstGeom prst="rect">
+                      <a:avLst/>
+                    </a:prstGeom>
+                  </pic:spPr>
+                </pic:pic>
+              </a:graphicData>
+            </a:graphic>
+          </wp:inline>
+        </w:drawing>
+      </w:r>
+    </w:p>
+    <w:p>
+      <w:pPr>
+        <w:ind w:left="708"/>
+      </w:pPr>
+    </w:p>
+    <w:p>
+      <w:pPr>
+        <w:ind w:left="708"/>
+      </w:pPr>
+    </w:p>
+    <w:p>
+      <w:pPr>
+        <w:pStyle w:val="Prrafodelista"/>
+        <w:numPr>
+          <w:ilvl w:val="0"/>
+          <w:numId w:val="3"/>
+        </w:numPr>
+      </w:pPr>
+      <w:r>
+        <w:t>Reporte de Carga de Trabajo</w:t>
+      </w:r>
+    </w:p>
+    <w:p>
+      <w:pPr>
+        <w:pStyle w:val="Prrafodelista"/>
+        <w:numPr>
+          <w:ilvl w:val="0"/>
+          <w:numId w:val="4"/>
+        </w:numPr>
+      </w:pPr>
+      <w:r>
+        <w:t>Al final de la pestaña de Tareas hay un resumen que muestra cuántas tareas activas y vencidas tiene cada usuario, para ver rápido quién anda más cargado de trabajo.</w:t>
+      </w:r>
+    </w:p>
+    <w:p>
+      <w:pPr>
+        <w:ind w:left="708"/>
+      </w:pPr>
+      <w:r>
+        <w:drawing>
+          <wp:inline distT="0" distB="0" distL="0" distR="0" wp14:anchorId="0BB9D370" wp14:editId="32A495EB">
+            <wp:extent cx="5049079" cy="2837037"/>
+            <wp:effectExtent l="0" t="0" r="0" b="1905"/>
+            <wp:docPr id="1469678602" name="Imagen 1"/>
+            <wp:cNvGraphicFramePr>
+              <a:graphicFrameLocks xmlns:a="http://schemas.openxmlformats.org/drawingml/2006/main" noChangeAspect="1"/>
+            </wp:cNvGraphicFramePr>
+            <a:graphic xmlns:a="http://schemas.openxmlformats.org/drawingml/2006/main">
+              <a:graphicData uri="http://schemas.openxmlformats.org/drawingml/2006/picture">
+                <pic:pic xmlns:pic="http://schemas.openxmlformats.org/drawingml/2006/picture">
+                  <pic:nvPicPr>
+                    <pic:cNvPr id="1469678602" name=""/>
+                    <pic:cNvPicPr/>
+                  </pic:nvPicPr>
+                  <pic:blipFill>
+                    <a:blip r:embed="rId17"/>
+                    <a:stretch>
+                      <a:fillRect/>
+                    </a:stretch>
+                  </pic:blipFill>
+                  <pic:spPr>
+                    <a:xfrm>
+                      <a:off x="0" y="0"/>
+                      <a:ext cx="5063111" cy="2844921"/>
+                    </a:xfrm>
+                    <a:prstGeom prst="rect">
+                      <a:avLst/>
+                    </a:prstGeom>
+                  </pic:spPr>
+                </pic:pic>
+              </a:graphicData>
+            </a:graphic>
+          </wp:inline>
+        </w:drawing>
+      </w:r>
+    </w:p>
+    <w:p>
+      <w:pPr>
+        <w:ind w:left="708"/>
+      </w:pPr>
+    </w:p>
+    <w:p>
+      <w:pPr>
+        <w:pStyle w:val="Prrafodelista"/>
+        <w:numPr>
+          <w:ilvl w:val="0"/>
+          <w:numId w:val="3"/>
+        </w:numPr>
+      </w:pPr>
+      <w:r>
+        <w:t>Módulo de Gestión de Disponibilidad:</w:t>
+      </w:r>
+    </w:p>
+    <w:p>
+      <w:pPr>
+        <w:pStyle w:val="Prrafodelista"/>
+        <w:numPr>
+          <w:ilvl w:val="0"/>
+          <w:numId w:val="4"/>
+        </w:numPr>
+      </w:pPr>
+      <w:r>
+        <w:t>Aquí se registran los horarios en que cada usuario está disponible, ocupado o no disponible, con fecha y hora de inicio y fin.</w:t>
+      </w:r>
+    </w:p>
+    <w:p>
+      <w:pPr>
+        <w:ind w:left="708"/>
+      </w:pPr>
+      <w:r>
+        <w:drawing>
+          <wp:inline distT="0" distB="0" distL="0" distR="0" wp14:anchorId="7AEB2486" wp14:editId="32C833B5">
+            <wp:extent cx="5160085" cy="2899410"/>
+            <wp:effectExtent l="0" t="0" r="2540" b="0"/>
+            <wp:docPr id="1358008137" name="Imagen 1"/>
+            <wp:cNvGraphicFramePr>
+              <a:graphicFrameLocks xmlns:a="http://schemas.openxmlformats.org/drawingml/2006/main" noChangeAspect="1"/>
+            </wp:cNvGraphicFramePr>
+            <a:graphic xmlns:a="http://schemas.openxmlformats.org/drawingml/2006/main">
+              <a:graphicData uri="http://schemas.openxmlformats.org/drawingml/2006/picture">
+                <pic:pic xmlns:pic="http://schemas.openxmlformats.org/drawingml/2006/picture">
+                  <pic:nvPicPr>
+                    <pic:cNvPr id="1358008137" name=""/>
+                    <pic:cNvPicPr/>
+                  </pic:nvPicPr>
+                  <pic:blipFill>
+                    <a:blip r:embed="rId18"/>
+                    <a:stretch>
+                      <a:fillRect/>
+                    </a:stretch>
+                  </pic:blipFill>
+                  <pic:spPr>
+                    <a:xfrm>
+                      <a:off x="0" y="0"/>
+                      <a:ext cx="5170856" cy="2905462"/>
+                    </a:xfrm>
+                    <a:prstGeom prst="rect">
+                      <a:avLst/>
+                    </a:prstGeom>
+                  </pic:spPr>
+                </pic:pic>
+              </a:graphicData>
+            </a:graphic>
+          </wp:inline>
+        </w:drawing>
+      </w:r>
+    </w:p>
+    <w:p>
+      <w:pPr>
+        <w:ind w:left="708"/>
+      </w:pPr>
+    </w:p>
+    <w:p>
+      <w:pPr>
+        <w:pStyle w:val="Prrafodelista"/>
+        <w:numPr>
+          <w:ilvl w:val="0"/>
+          <w:numId w:val="3"/>
+        </w:numPr>
+      </w:pPr>
+      <w:r>
+        <w:lastRenderedPageBreak/>
+        <w:t>Búsqueda de Disponibilidad (RF-12)</w:t>
+      </w:r>
+    </w:p>
+    <w:p>
+      <w:pPr>
+        <w:pStyle w:val="Prrafodelista"/>
+        <w:numPr>
+          <w:ilvl w:val="0"/>
+          <w:numId w:val="4"/>
+        </w:numPr>
+      </w:pPr>
+      <w:r>
+        <w:t>Esta parte de abajo sirve para buscar quién está libre en un horario específico. Revisa tanto los eventos ya agendados como las disponibilidades marcadas, y muestra la lista de usuarios que sí están libres en ese rango.</w:t>
+      </w:r>
+    </w:p>
+    <w:p>
+      <w:pPr>
+        <w:ind w:left="708"/>
+      </w:pPr>
+      <w:r>
+        <w:drawing>
+          <wp:inline distT="0" distB="0" distL="0" distR="0" wp14:anchorId="61BF9670" wp14:editId="26881044">
+            <wp:extent cx="5112689" cy="2872778"/>
+            <wp:effectExtent l="0" t="0" r="0" b="3810"/>
+            <wp:docPr id="2102705337" name="Imagen 1"/>
+            <wp:cNvGraphicFramePr>
+              <a:graphicFrameLocks xmlns:a="http://schemas.openxmlformats.org/drawingml/2006/main" noChangeAspect="1"/>
+            </wp:cNvGraphicFramePr>
+            <a:graphic xmlns:a="http://schemas.openxmlformats.org/drawingml/2006/main">
+              <a:graphicData uri="http://schemas.openxmlformats.org/drawingml/2006/picture">
+                <pic:pic xmlns:pic="http://schemas.openxmlformats.org/drawingml/2006/picture">
+                  <pic:nvPicPr>
+                    <pic:cNvPr id="2102705337" name=""/>
+                    <pic:cNvPicPr/>
+                  </pic:nvPicPr>
+                  <pic:blipFill>
+                    <a:blip r:embed="rId19"/>
+                    <a:stretch>
+                      <a:fillRect/>
+                    </a:stretch>
+                  </pic:blipFill>
+                  <pic:spPr>
+                    <a:xfrm>
+                      <a:off x="0" y="0"/>
+                      <a:ext cx="5119193" cy="2876433"/>
+                    </a:xfrm>
+                    <a:prstGeom prst="rect">
+                      <a:avLst/>
+                    </a:prstGeom>
+                  </pic:spPr>
+                </pic:pic>
+              </a:graphicData>
+            </a:graphic>
+          </wp:inline>
+        </w:drawing>
+      </w:r>
     </w:p>
     <w:p/>
     <w:p/>
     <w:p/>
+    <w:p>
+      <w:pPr>
+        <w:pStyle w:val="Subttulo"/>
+      </w:pPr>
+      <w:r>
+        <w:t>Declaración de IA:</w:t>
+      </w:r>
+    </w:p>
     <w:p/>
+    <w:p>
+      <w:r>
+        <w:t xml:space="preserve">Se utilizó la IA como una herramienta complementadora para el desarrollo de este proyecto. Se utilizó para la generación de ideas para las taras de las matrices de trazabilidad. </w:t>
+      </w:r>
+      <w:r>
+        <w:t>Además,</w:t>
+      </w:r>
+      <w:r>
+        <w:t xml:space="preserve"> se </w:t>
+      </w:r>
+      <w:r>
+        <w:t>utilizó</w:t>
+      </w:r>
+      <w:r>
+        <w:t xml:space="preserve"> para poder correr el modelo físico y correcto funcionamiento de la base de datos ya dada, se le pidió ayuda para el mejor entendimiento y de lógica y errores en la creación de los nuevos módulos de la base de datos. Se utilizó también para ayudas, preguntas y corrección de</w:t>
+      </w:r>
+      <w:r>
+        <w:t xml:space="preserve">l desarrollo de código para la interfaz, aquí cabe aclarar que sí se utilizó bastante la IA, </w:t>
+      </w:r>
+      <w:r>
+        <w:t>nosotros</w:t>
+      </w:r>
+      <w:r>
+        <w:t xml:space="preserve"> no tenemos las bases para saber utilizar y deseñar interfases en </w:t>
+      </w:r>
+      <w:r>
+        <w:t>Python</w:t>
+      </w:r>
+      <w:r>
+        <w:t xml:space="preserve"> utilizando Tkinter, por lo que si se utilizó la </w:t>
+      </w:r>
+      <w:r>
+        <w:t>IA</w:t>
+      </w:r>
+      <w:r>
+        <w:t xml:space="preserve"> para complementar lógica, ideas, corrección de errores, desarrollo e implementación de la interfaz</w:t>
+      </w:r>
+      <w:r>
+        <w:t xml:space="preserve"> para su correcto funcionamiento.</w:t>
+      </w:r>
+    </w:p>
     <w:sectPr>
       <w:pgSz w:w="12240" w:h="15840"/>
       <w:pgMar w:top="1417" w:right="1701" w:bottom="1417" w:left="1701" w:header="708" w:footer="708" w:gutter="0"/>
@@ -4212,19 +4480,69 @@
 </w:document>
 </file>
 
+<file path=word/endnotes.xml><?xml version="1.0" encoding="utf-8"?>
+<w:endnotes xmlns:wpc="http://schemas.microsoft.com/office/word/2010/wordprocessingCanvas" xmlns:cx="http://schemas.microsoft.com/office/drawing/2014/chartex" xmlns:cx1="http://schemas.microsoft.com/office/drawing/2015/9/8/chartex" xmlns:cx2="http://schemas.microsoft.com/office/drawing/2015/10/21/chartex" xmlns:cx3="http://schemas.microsoft.com/office/drawing/2016/5/9/chartex" xmlns:cx4="http://schemas.microsoft.com/office/drawing/2016/5/10/chartex" xmlns:cx5="http://schemas.microsoft.com/office/drawing/2016/5/11/chartex" xmlns:cx6="http://schemas.microsoft.com/office/drawing/2016/5/12/chartex" xmlns:cx7="http://schemas.microsoft.com/office/drawing/2016/5/13/chartex" xmlns:cx8="http://schemas.microsoft.com/office/drawing/2016/5/14/chartex" xmlns:mc="http://schemas.openxmlformats.org/markup-compatibility/2006" xmlns:aink="http://schemas.microsoft.com/office/drawing/2016/ink" xmlns:am3d="http://schemas.microsoft.com/office/drawing/2017/model3d" xmlns:o="urn:schemas-microsoft-com:office:office" xmlns:oel="http://schemas.microsoft.com/office/2019/extlst" xmlns:r="http://schemas.openxmlformats.org/officeDocument/2006/relationships" xmlns:m="http://schemas.openxmlformats.org/officeDocument/2006/math" xmlns:v="urn:schemas-microsoft-com:vml" xmlns:wp14="http://schemas.microsoft.com/office/word/2010/wordprocessingDrawing" xmlns:wp="http://schemas.openxmlformats.org/drawingml/2006/wordprocessingDrawing" xmlns:w10="urn:schemas-microsoft-com:office:word" xmlns:w="http://schemas.openxmlformats.org/wordprocessingml/2006/main" xmlns:w14="http://schemas.microsoft.com/office/word/2010/wordml" xmlns:w15="http://schemas.microsoft.com/office/word/2012/wordml" xmlns:w16cex="http://schemas.microsoft.com/office/word/2018/wordml/cex" xmlns:w16cid="http://schemas.microsoft.com/office/word/2016/wordml/cid" xmlns:w16="http://schemas.microsoft.com/office/word/2018/wordml" xmlns:w16du="http://schemas.microsoft.com/office/word/2023/wordml/word16du" xmlns:w16sdtdh="http://schemas.microsoft.com/office/word/2020/wordml/sdtdatahash" xmlns:w16sdtfl="http://schemas.microsoft.com/office/word/2024/wordml/sdtformatlock" xmlns:w16se="http://schemas.microsoft.com/office/word/2015/wordml/symex" xmlns:wpg="http://schemas.microsoft.com/office/word/2010/wordprocessingGroup" xmlns:wpi="http://schemas.microsoft.com/office/word/2010/wordprocessingInk" xmlns:wne="http://schemas.microsoft.com/office/word/2006/wordml" xmlns:wps="http://schemas.microsoft.com/office/word/2010/wordprocessingShape" mc:Ignorable="w14 w15 w16se w16cid w16 w16cex w16sdtdh w16sdtfl w16du wp14">
+  <w:endnote w:type="separator" w:id="-1">
+    <w:p>
+      <w:pPr>
+        <w:spacing w:after="0" w:line="240" w:lineRule="auto"/>
+      </w:pPr>
+      <w:r>
+        <w:separator/>
+      </w:r>
+    </w:p>
+  </w:endnote>
+  <w:endnote w:type="continuationSeparator" w:id="0">
+    <w:p>
+      <w:pPr>
+        <w:spacing w:after="0" w:line="240" w:lineRule="auto"/>
+      </w:pPr>
+      <w:r>
+        <w:continuationSeparator/>
+      </w:r>
+    </w:p>
+  </w:endnote>
+</w:endnotes>
+</file>
+
+<file path=word/footnotes.xml><?xml version="1.0" encoding="utf-8"?>
+<w:footnotes xmlns:wpc="http://schemas.microsoft.com/office/word/2010/wordprocessingCanvas" xmlns:cx="http://schemas.microsoft.com/office/drawing/2014/chartex" xmlns:cx1="http://schemas.microsoft.com/office/drawing/2015/9/8/chartex" xmlns:cx2="http://schemas.microsoft.com/office/drawing/2015/10/21/chartex" xmlns:cx3="http://schemas.microsoft.com/office/drawing/2016/5/9/chartex" xmlns:cx4="http://schemas.microsoft.com/office/drawing/2016/5/10/chartex" xmlns:cx5="http://schemas.microsoft.com/office/drawing/2016/5/11/chartex" xmlns:cx6="http://schemas.microsoft.com/office/drawing/2016/5/12/chartex" xmlns:cx7="http://schemas.microsoft.com/office/drawing/2016/5/13/chartex" xmlns:cx8="http://schemas.microsoft.com/office/drawing/2016/5/14/chartex" xmlns:mc="http://schemas.openxmlformats.org/markup-compatibility/2006" xmlns:aink="http://schemas.microsoft.com/office/drawing/2016/ink" xmlns:am3d="http://schemas.microsoft.com/office/drawing/2017/model3d" xmlns:o="urn:schemas-microsoft-com:office:office" xmlns:oel="http://schemas.microsoft.com/office/2019/extlst" xmlns:r="http://schemas.openxmlformats.org/officeDocument/2006/relationships" xmlns:m="http://schemas.openxmlformats.org/officeDocument/2006/math" xmlns:v="urn:schemas-microsoft-com:vml" xmlns:wp14="http://schemas.microsoft.com/office/word/2010/wordprocessingDrawing" xmlns:wp="http://schemas.openxmlformats.org/drawingml/2006/wordprocessingDrawing" xmlns:w10="urn:schemas-microsoft-com:office:word" xmlns:w="http://schemas.openxmlformats.org/wordprocessingml/2006/main" xmlns:w14="http://schemas.microsoft.com/office/word/2010/wordml" xmlns:w15="http://schemas.microsoft.com/office/word/2012/wordml" xmlns:w16cex="http://schemas.microsoft.com/office/word/2018/wordml/cex" xmlns:w16cid="http://schemas.microsoft.com/office/word/2016/wordml/cid" xmlns:w16="http://schemas.microsoft.com/office/word/2018/wordml" xmlns:w16du="http://schemas.microsoft.com/office/word/2023/wordml/word16du" xmlns:w16sdtdh="http://schemas.microsoft.com/office/word/2020/wordml/sdtdatahash" xmlns:w16sdtfl="http://schemas.microsoft.com/office/word/2024/wordml/sdtformatlock" xmlns:w16se="http://schemas.microsoft.com/office/word/2015/wordml/symex" xmlns:wpg="http://schemas.microsoft.com/office/word/2010/wordprocessingGroup" xmlns:wpi="http://schemas.microsoft.com/office/word/2010/wordprocessingInk" xmlns:wne="http://schemas.microsoft.com/office/word/2006/wordml" xmlns:wps="http://schemas.microsoft.com/office/word/2010/wordprocessingShape" mc:Ignorable="w14 w15 w16se w16cid w16 w16cex w16sdtdh w16sdtfl w16du wp14">
+  <w:footnote w:type="separator" w:id="-1">
+    <w:p>
+      <w:pPr>
+        <w:spacing w:after="0" w:line="240" w:lineRule="auto"/>
+      </w:pPr>
+      <w:r>
+        <w:separator/>
+      </w:r>
+    </w:p>
+  </w:footnote>
+  <w:footnote w:type="continuationSeparator" w:id="0">
+    <w:p>
+      <w:pPr>
+        <w:spacing w:after="0" w:line="240" w:lineRule="auto"/>
+      </w:pPr>
+      <w:r>
+        <w:continuationSeparator/>
+      </w:r>
+    </w:p>
+  </w:footnote>
+</w:footnotes>
+</file>
+
 <file path=word/numbering.xml><?xml version="1.0" encoding="utf-8"?>
 <w:numbering xmlns:wpc="http://schemas.microsoft.com/office/word/2010/wordprocessingCanvas" xmlns:cx="http://schemas.microsoft.com/office/drawing/2014/chartex" xmlns:cx1="http://schemas.microsoft.com/office/drawing/2015/9/8/chartex" xmlns:cx2="http://schemas.microsoft.com/office/drawing/2015/10/21/chartex" xmlns:cx3="http://schemas.microsoft.com/office/drawing/2016/5/9/chartex" xmlns:cx4="http://schemas.microsoft.com/office/drawing/2016/5/10/chartex" xmlns:cx5="http://schemas.microsoft.com/office/drawing/2016/5/11/chartex" xmlns:cx6="http://schemas.microsoft.com/office/drawing/2016/5/12/chartex" xmlns:cx7="http://schemas.microsoft.com/office/drawing/2016/5/13/chartex" xmlns:cx8="http://schemas.microsoft.com/office/drawing/2016/5/14/chartex" xmlns:mc="http://schemas.openxmlformats.org/markup-compatibility/2006" xmlns:aink="http://schemas.microsoft.com/office/drawing/2016/ink" xmlns:am3d="http://schemas.microsoft.com/office/drawing/2017/model3d" xmlns:o="urn:schemas-microsoft-com:office:office" xmlns:oel="http://schemas.microsoft.com/office/2019/extlst" xmlns:r="http://schemas.openxmlformats.org/officeDocument/2006/relationships" xmlns:m="http://schemas.openxmlformats.org/officeDocument/2006/math" xmlns:v="urn:schemas-microsoft-com:vml" xmlns:wp14="http://schemas.microsoft.com/office/word/2010/wordprocessingDrawing" xmlns:wp="http://schemas.openxmlformats.org/drawingml/2006/wordprocessingDrawing" xmlns:w10="urn:schemas-microsoft-com:office:word" xmlns:w="http://schemas.openxmlformats.org/wordprocessingml/2006/main" xmlns:w14="http://schemas.microsoft.com/office/word/2010/wordml" xmlns:w15="http://schemas.microsoft.com/office/word/2012/wordml" xmlns:w16cex="http://schemas.microsoft.com/office/word/2018/wordml/cex" xmlns:w16cid="http://schemas.microsoft.com/office/word/2016/wordml/cid" xmlns:w16="http://schemas.microsoft.com/office/word/2018/wordml" xmlns:w16du="http://schemas.microsoft.com/office/word/2023/wordml/word16du" xmlns:w16sdtdh="http://schemas.microsoft.com/office/word/2020/wordml/sdtdatahash" xmlns:w16sdtfl="http://schemas.microsoft.com/office/word/2024/wordml/sdtformatlock" xmlns:w16se="http://schemas.microsoft.com/office/word/2015/wordml/symex" xmlns:wpg="http://schemas.microsoft.com/office/word/2010/wordprocessingGroup" xmlns:wpi="http://schemas.microsoft.com/office/word/2010/wordprocessingInk" xmlns:wne="http://schemas.microsoft.com/office/word/2006/wordml" xmlns:wps="http://schemas.microsoft.com/office/word/2010/wordprocessingShape" mc:Ignorable="w14 w15 w16se w16cid w16 w16cex w16sdtdh w16sdtfl w16du wp14">
   <w:abstractNum w:abstractNumId="0" w15:restartNumberingAfterBreak="0">
-    <w:nsid w:val="2B22784C"/>
+    <w:nsid w:val="03934436"/>
     <w:multiLevelType w:val="hybridMultilevel"/>
-    <w:tmpl w:val="AE6E4B98"/>
+    <w:tmpl w:val="0D2A4A6C"/>
     <w:lvl w:ilvl="0" w:tplc="140A0001">
       <w:start w:val="1"/>
       <w:numFmt w:val="bullet"/>
       <w:lvlText w:val=""/>
       <w:lvlJc w:val="left"/>
       <w:pPr>
-        <w:ind w:left="720" w:hanging="360"/>
+        <w:ind w:left="1080" w:hanging="360"/>
       </w:pPr>
       <w:rPr>
         <w:rFonts w:ascii="Symbol" w:hAnsi="Symbol" w:hint="default"/>
@@ -4236,7 +4554,7 @@
       <w:lvlText w:val="o"/>
       <w:lvlJc w:val="left"/>
       <w:pPr>
-        <w:ind w:left="1440" w:hanging="360"/>
+        <w:ind w:left="1800" w:hanging="360"/>
       </w:pPr>
       <w:rPr>
         <w:rFonts w:ascii="Courier New" w:hAnsi="Courier New" w:cs="Courier New" w:hint="default"/>
@@ -4248,7 +4566,7 @@
       <w:lvlText w:val=""/>
       <w:lvlJc w:val="left"/>
       <w:pPr>
-        <w:ind w:left="2160" w:hanging="360"/>
+        <w:ind w:left="2520" w:hanging="360"/>
       </w:pPr>
       <w:rPr>
         <w:rFonts w:ascii="Wingdings" w:hAnsi="Wingdings" w:hint="default"/>
@@ -4260,7 +4578,7 @@
       <w:lvlText w:val=""/>
       <w:lvlJc w:val="left"/>
       <w:pPr>
-        <w:ind w:left="2880" w:hanging="360"/>
+        <w:ind w:left="3240" w:hanging="360"/>
       </w:pPr>
       <w:rPr>
         <w:rFonts w:ascii="Symbol" w:hAnsi="Symbol" w:hint="default"/>
@@ -4272,7 +4590,7 @@
       <w:lvlText w:val="o"/>
       <w:lvlJc w:val="left"/>
       <w:pPr>
-        <w:ind w:left="3600" w:hanging="360"/>
+        <w:ind w:left="3960" w:hanging="360"/>
       </w:pPr>
       <w:rPr>
         <w:rFonts w:ascii="Courier New" w:hAnsi="Courier New" w:cs="Courier New" w:hint="default"/>
@@ -4284,7 +4602,7 @@
       <w:lvlText w:val=""/>
       <w:lvlJc w:val="left"/>
       <w:pPr>
-        <w:ind w:left="4320" w:hanging="360"/>
+        <w:ind w:left="4680" w:hanging="360"/>
       </w:pPr>
       <w:rPr>
         <w:rFonts w:ascii="Wingdings" w:hAnsi="Wingdings" w:hint="default"/>
@@ -4296,7 +4614,7 @@
       <w:lvlText w:val=""/>
       <w:lvlJc w:val="left"/>
       <w:pPr>
-        <w:ind w:left="5040" w:hanging="360"/>
+        <w:ind w:left="5400" w:hanging="360"/>
       </w:pPr>
       <w:rPr>
         <w:rFonts w:ascii="Symbol" w:hAnsi="Symbol" w:hint="default"/>
@@ -4308,7 +4626,7 @@
       <w:lvlText w:val="o"/>
       <w:lvlJc w:val="left"/>
       <w:pPr>
-        <w:ind w:left="5760" w:hanging="360"/>
+        <w:ind w:left="6120" w:hanging="360"/>
       </w:pPr>
       <w:rPr>
         <w:rFonts w:ascii="Courier New" w:hAnsi="Courier New" w:cs="Courier New" w:hint="default"/>
@@ -4320,6 +4638,431 @@
       <w:lvlText w:val=""/>
       <w:lvlJc w:val="left"/>
       <w:pPr>
+        <w:ind w:left="6840" w:hanging="360"/>
+      </w:pPr>
+      <w:rPr>
+        <w:rFonts w:ascii="Wingdings" w:hAnsi="Wingdings" w:hint="default"/>
+      </w:rPr>
+    </w:lvl>
+  </w:abstractNum>
+  <w:abstractNum w:abstractNumId="1" w15:restartNumberingAfterBreak="0">
+    <w:nsid w:val="2B22784C"/>
+    <w:multiLevelType w:val="hybridMultilevel"/>
+    <w:tmpl w:val="AE6E4B98"/>
+    <w:lvl w:ilvl="0" w:tplc="140A0001">
+      <w:start w:val="1"/>
+      <w:numFmt w:val="bullet"/>
+      <w:lvlText w:val=""/>
+      <w:lvlJc w:val="left"/>
+      <w:pPr>
+        <w:ind w:left="720" w:hanging="360"/>
+      </w:pPr>
+      <w:rPr>
+        <w:rFonts w:ascii="Symbol" w:hAnsi="Symbol" w:hint="default"/>
+      </w:rPr>
+    </w:lvl>
+    <w:lvl w:ilvl="1" w:tplc="140A0003" w:tentative="1">
+      <w:start w:val="1"/>
+      <w:numFmt w:val="bullet"/>
+      <w:lvlText w:val="o"/>
+      <w:lvlJc w:val="left"/>
+      <w:pPr>
+        <w:ind w:left="1440" w:hanging="360"/>
+      </w:pPr>
+      <w:rPr>
+        <w:rFonts w:ascii="Courier New" w:hAnsi="Courier New" w:cs="Courier New" w:hint="default"/>
+      </w:rPr>
+    </w:lvl>
+    <w:lvl w:ilvl="2" w:tplc="140A0005" w:tentative="1">
+      <w:start w:val="1"/>
+      <w:numFmt w:val="bullet"/>
+      <w:lvlText w:val=""/>
+      <w:lvlJc w:val="left"/>
+      <w:pPr>
+        <w:ind w:left="2160" w:hanging="360"/>
+      </w:pPr>
+      <w:rPr>
+        <w:rFonts w:ascii="Wingdings" w:hAnsi="Wingdings" w:hint="default"/>
+      </w:rPr>
+    </w:lvl>
+    <w:lvl w:ilvl="3" w:tplc="140A0001" w:tentative="1">
+      <w:start w:val="1"/>
+      <w:numFmt w:val="bullet"/>
+      <w:lvlText w:val=""/>
+      <w:lvlJc w:val="left"/>
+      <w:pPr>
+        <w:ind w:left="2880" w:hanging="360"/>
+      </w:pPr>
+      <w:rPr>
+        <w:rFonts w:ascii="Symbol" w:hAnsi="Symbol" w:hint="default"/>
+      </w:rPr>
+    </w:lvl>
+    <w:lvl w:ilvl="4" w:tplc="140A0003" w:tentative="1">
+      <w:start w:val="1"/>
+      <w:numFmt w:val="bullet"/>
+      <w:lvlText w:val="o"/>
+      <w:lvlJc w:val="left"/>
+      <w:pPr>
+        <w:ind w:left="3600" w:hanging="360"/>
+      </w:pPr>
+      <w:rPr>
+        <w:rFonts w:ascii="Courier New" w:hAnsi="Courier New" w:cs="Courier New" w:hint="default"/>
+      </w:rPr>
+    </w:lvl>
+    <w:lvl w:ilvl="5" w:tplc="140A0005" w:tentative="1">
+      <w:start w:val="1"/>
+      <w:numFmt w:val="bullet"/>
+      <w:lvlText w:val=""/>
+      <w:lvlJc w:val="left"/>
+      <w:pPr>
+        <w:ind w:left="4320" w:hanging="360"/>
+      </w:pPr>
+      <w:rPr>
+        <w:rFonts w:ascii="Wingdings" w:hAnsi="Wingdings" w:hint="default"/>
+      </w:rPr>
+    </w:lvl>
+    <w:lvl w:ilvl="6" w:tplc="140A0001" w:tentative="1">
+      <w:start w:val="1"/>
+      <w:numFmt w:val="bullet"/>
+      <w:lvlText w:val=""/>
+      <w:lvlJc w:val="left"/>
+      <w:pPr>
+        <w:ind w:left="5040" w:hanging="360"/>
+      </w:pPr>
+      <w:rPr>
+        <w:rFonts w:ascii="Symbol" w:hAnsi="Symbol" w:hint="default"/>
+      </w:rPr>
+    </w:lvl>
+    <w:lvl w:ilvl="7" w:tplc="140A0003" w:tentative="1">
+      <w:start w:val="1"/>
+      <w:numFmt w:val="bullet"/>
+      <w:lvlText w:val="o"/>
+      <w:lvlJc w:val="left"/>
+      <w:pPr>
+        <w:ind w:left="5760" w:hanging="360"/>
+      </w:pPr>
+      <w:rPr>
+        <w:rFonts w:ascii="Courier New" w:hAnsi="Courier New" w:cs="Courier New" w:hint="default"/>
+      </w:rPr>
+    </w:lvl>
+    <w:lvl w:ilvl="8" w:tplc="140A0005" w:tentative="1">
+      <w:start w:val="1"/>
+      <w:numFmt w:val="bullet"/>
+      <w:lvlText w:val=""/>
+      <w:lvlJc w:val="left"/>
+      <w:pPr>
+        <w:ind w:left="6480" w:hanging="360"/>
+      </w:pPr>
+      <w:rPr>
+        <w:rFonts w:ascii="Wingdings" w:hAnsi="Wingdings" w:hint="default"/>
+      </w:rPr>
+    </w:lvl>
+  </w:abstractNum>
+  <w:abstractNum w:abstractNumId="2" w15:restartNumberingAfterBreak="0">
+    <w:nsid w:val="38584489"/>
+    <w:multiLevelType w:val="hybridMultilevel"/>
+    <w:tmpl w:val="E88CFF0A"/>
+    <w:lvl w:ilvl="0" w:tplc="140A0001">
+      <w:start w:val="1"/>
+      <w:numFmt w:val="bullet"/>
+      <w:lvlText w:val=""/>
+      <w:lvlJc w:val="left"/>
+      <w:pPr>
+        <w:ind w:left="1440" w:hanging="360"/>
+      </w:pPr>
+      <w:rPr>
+        <w:rFonts w:ascii="Symbol" w:hAnsi="Symbol" w:hint="default"/>
+      </w:rPr>
+    </w:lvl>
+    <w:lvl w:ilvl="1" w:tplc="140A0003" w:tentative="1">
+      <w:start w:val="1"/>
+      <w:numFmt w:val="bullet"/>
+      <w:lvlText w:val="o"/>
+      <w:lvlJc w:val="left"/>
+      <w:pPr>
+        <w:ind w:left="2160" w:hanging="360"/>
+      </w:pPr>
+      <w:rPr>
+        <w:rFonts w:ascii="Courier New" w:hAnsi="Courier New" w:cs="Courier New" w:hint="default"/>
+      </w:rPr>
+    </w:lvl>
+    <w:lvl w:ilvl="2" w:tplc="140A0005" w:tentative="1">
+      <w:start w:val="1"/>
+      <w:numFmt w:val="bullet"/>
+      <w:lvlText w:val=""/>
+      <w:lvlJc w:val="left"/>
+      <w:pPr>
+        <w:ind w:left="2880" w:hanging="360"/>
+      </w:pPr>
+      <w:rPr>
+        <w:rFonts w:ascii="Wingdings" w:hAnsi="Wingdings" w:hint="default"/>
+      </w:rPr>
+    </w:lvl>
+    <w:lvl w:ilvl="3" w:tplc="140A0001" w:tentative="1">
+      <w:start w:val="1"/>
+      <w:numFmt w:val="bullet"/>
+      <w:lvlText w:val=""/>
+      <w:lvlJc w:val="left"/>
+      <w:pPr>
+        <w:ind w:left="3600" w:hanging="360"/>
+      </w:pPr>
+      <w:rPr>
+        <w:rFonts w:ascii="Symbol" w:hAnsi="Symbol" w:hint="default"/>
+      </w:rPr>
+    </w:lvl>
+    <w:lvl w:ilvl="4" w:tplc="140A0003" w:tentative="1">
+      <w:start w:val="1"/>
+      <w:numFmt w:val="bullet"/>
+      <w:lvlText w:val="o"/>
+      <w:lvlJc w:val="left"/>
+      <w:pPr>
+        <w:ind w:left="4320" w:hanging="360"/>
+      </w:pPr>
+      <w:rPr>
+        <w:rFonts w:ascii="Courier New" w:hAnsi="Courier New" w:cs="Courier New" w:hint="default"/>
+      </w:rPr>
+    </w:lvl>
+    <w:lvl w:ilvl="5" w:tplc="140A0005" w:tentative="1">
+      <w:start w:val="1"/>
+      <w:numFmt w:val="bullet"/>
+      <w:lvlText w:val=""/>
+      <w:lvlJc w:val="left"/>
+      <w:pPr>
+        <w:ind w:left="5040" w:hanging="360"/>
+      </w:pPr>
+      <w:rPr>
+        <w:rFonts w:ascii="Wingdings" w:hAnsi="Wingdings" w:hint="default"/>
+      </w:rPr>
+    </w:lvl>
+    <w:lvl w:ilvl="6" w:tplc="140A0001" w:tentative="1">
+      <w:start w:val="1"/>
+      <w:numFmt w:val="bullet"/>
+      <w:lvlText w:val=""/>
+      <w:lvlJc w:val="left"/>
+      <w:pPr>
+        <w:ind w:left="5760" w:hanging="360"/>
+      </w:pPr>
+      <w:rPr>
+        <w:rFonts w:ascii="Symbol" w:hAnsi="Symbol" w:hint="default"/>
+      </w:rPr>
+    </w:lvl>
+    <w:lvl w:ilvl="7" w:tplc="140A0003" w:tentative="1">
+      <w:start w:val="1"/>
+      <w:numFmt w:val="bullet"/>
+      <w:lvlText w:val="o"/>
+      <w:lvlJc w:val="left"/>
+      <w:pPr>
+        <w:ind w:left="6480" w:hanging="360"/>
+      </w:pPr>
+      <w:rPr>
+        <w:rFonts w:ascii="Courier New" w:hAnsi="Courier New" w:cs="Courier New" w:hint="default"/>
+      </w:rPr>
+    </w:lvl>
+    <w:lvl w:ilvl="8" w:tplc="140A0005" w:tentative="1">
+      <w:start w:val="1"/>
+      <w:numFmt w:val="bullet"/>
+      <w:lvlText w:val=""/>
+      <w:lvlJc w:val="left"/>
+      <w:pPr>
+        <w:ind w:left="7200" w:hanging="360"/>
+      </w:pPr>
+      <w:rPr>
+        <w:rFonts w:ascii="Wingdings" w:hAnsi="Wingdings" w:hint="default"/>
+      </w:rPr>
+    </w:lvl>
+  </w:abstractNum>
+  <w:abstractNum w:abstractNumId="3" w15:restartNumberingAfterBreak="0">
+    <w:nsid w:val="48174D6E"/>
+    <w:multiLevelType w:val="hybridMultilevel"/>
+    <w:tmpl w:val="D6145EEC"/>
+    <w:lvl w:ilvl="0" w:tplc="140A000F">
+      <w:start w:val="1"/>
+      <w:numFmt w:val="decimal"/>
+      <w:lvlText w:val="%1."/>
+      <w:lvlJc w:val="left"/>
+      <w:pPr>
+        <w:ind w:left="720" w:hanging="360"/>
+      </w:pPr>
+    </w:lvl>
+    <w:lvl w:ilvl="1" w:tplc="140A0019" w:tentative="1">
+      <w:start w:val="1"/>
+      <w:numFmt w:val="lowerLetter"/>
+      <w:lvlText w:val="%2."/>
+      <w:lvlJc w:val="left"/>
+      <w:pPr>
+        <w:ind w:left="1440" w:hanging="360"/>
+      </w:pPr>
+    </w:lvl>
+    <w:lvl w:ilvl="2" w:tplc="140A001B" w:tentative="1">
+      <w:start w:val="1"/>
+      <w:numFmt w:val="lowerRoman"/>
+      <w:lvlText w:val="%3."/>
+      <w:lvlJc w:val="right"/>
+      <w:pPr>
+        <w:ind w:left="2160" w:hanging="180"/>
+      </w:pPr>
+    </w:lvl>
+    <w:lvl w:ilvl="3" w:tplc="140A000F" w:tentative="1">
+      <w:start w:val="1"/>
+      <w:numFmt w:val="decimal"/>
+      <w:lvlText w:val="%4."/>
+      <w:lvlJc w:val="left"/>
+      <w:pPr>
+        <w:ind w:left="2880" w:hanging="360"/>
+      </w:pPr>
+    </w:lvl>
+    <w:lvl w:ilvl="4" w:tplc="140A0019" w:tentative="1">
+      <w:start w:val="1"/>
+      <w:numFmt w:val="lowerLetter"/>
+      <w:lvlText w:val="%5."/>
+      <w:lvlJc w:val="left"/>
+      <w:pPr>
+        <w:ind w:left="3600" w:hanging="360"/>
+      </w:pPr>
+    </w:lvl>
+    <w:lvl w:ilvl="5" w:tplc="140A001B" w:tentative="1">
+      <w:start w:val="1"/>
+      <w:numFmt w:val="lowerRoman"/>
+      <w:lvlText w:val="%6."/>
+      <w:lvlJc w:val="right"/>
+      <w:pPr>
+        <w:ind w:left="4320" w:hanging="180"/>
+      </w:pPr>
+    </w:lvl>
+    <w:lvl w:ilvl="6" w:tplc="140A000F" w:tentative="1">
+      <w:start w:val="1"/>
+      <w:numFmt w:val="decimal"/>
+      <w:lvlText w:val="%7."/>
+      <w:lvlJc w:val="left"/>
+      <w:pPr>
+        <w:ind w:left="5040" w:hanging="360"/>
+      </w:pPr>
+    </w:lvl>
+    <w:lvl w:ilvl="7" w:tplc="140A0019" w:tentative="1">
+      <w:start w:val="1"/>
+      <w:numFmt w:val="lowerLetter"/>
+      <w:lvlText w:val="%8."/>
+      <w:lvlJc w:val="left"/>
+      <w:pPr>
+        <w:ind w:left="5760" w:hanging="360"/>
+      </w:pPr>
+    </w:lvl>
+    <w:lvl w:ilvl="8" w:tplc="140A001B" w:tentative="1">
+      <w:start w:val="1"/>
+      <w:numFmt w:val="lowerRoman"/>
+      <w:lvlText w:val="%9."/>
+      <w:lvlJc w:val="right"/>
+      <w:pPr>
+        <w:ind w:left="6480" w:hanging="180"/>
+      </w:pPr>
+    </w:lvl>
+  </w:abstractNum>
+  <w:abstractNum w:abstractNumId="4" w15:restartNumberingAfterBreak="0">
+    <w:nsid w:val="775B337B"/>
+    <w:multiLevelType w:val="hybridMultilevel"/>
+    <w:tmpl w:val="5AB2ED2C"/>
+    <w:lvl w:ilvl="0" w:tplc="140A0001">
+      <w:start w:val="1"/>
+      <w:numFmt w:val="bullet"/>
+      <w:lvlText w:val=""/>
+      <w:lvlJc w:val="left"/>
+      <w:pPr>
+        <w:ind w:left="720" w:hanging="360"/>
+      </w:pPr>
+      <w:rPr>
+        <w:rFonts w:ascii="Symbol" w:hAnsi="Symbol" w:hint="default"/>
+      </w:rPr>
+    </w:lvl>
+    <w:lvl w:ilvl="1" w:tplc="140A0003" w:tentative="1">
+      <w:start w:val="1"/>
+      <w:numFmt w:val="bullet"/>
+      <w:lvlText w:val="o"/>
+      <w:lvlJc w:val="left"/>
+      <w:pPr>
+        <w:ind w:left="1440" w:hanging="360"/>
+      </w:pPr>
+      <w:rPr>
+        <w:rFonts w:ascii="Courier New" w:hAnsi="Courier New" w:cs="Courier New" w:hint="default"/>
+      </w:rPr>
+    </w:lvl>
+    <w:lvl w:ilvl="2" w:tplc="140A0005" w:tentative="1">
+      <w:start w:val="1"/>
+      <w:numFmt w:val="bullet"/>
+      <w:lvlText w:val=""/>
+      <w:lvlJc w:val="left"/>
+      <w:pPr>
+        <w:ind w:left="2160" w:hanging="360"/>
+      </w:pPr>
+      <w:rPr>
+        <w:rFonts w:ascii="Wingdings" w:hAnsi="Wingdings" w:hint="default"/>
+      </w:rPr>
+    </w:lvl>
+    <w:lvl w:ilvl="3" w:tplc="140A0001" w:tentative="1">
+      <w:start w:val="1"/>
+      <w:numFmt w:val="bullet"/>
+      <w:lvlText w:val=""/>
+      <w:lvlJc w:val="left"/>
+      <w:pPr>
+        <w:ind w:left="2880" w:hanging="360"/>
+      </w:pPr>
+      <w:rPr>
+        <w:rFonts w:ascii="Symbol" w:hAnsi="Symbol" w:hint="default"/>
+      </w:rPr>
+    </w:lvl>
+    <w:lvl w:ilvl="4" w:tplc="140A0003" w:tentative="1">
+      <w:start w:val="1"/>
+      <w:numFmt w:val="bullet"/>
+      <w:lvlText w:val="o"/>
+      <w:lvlJc w:val="left"/>
+      <w:pPr>
+        <w:ind w:left="3600" w:hanging="360"/>
+      </w:pPr>
+      <w:rPr>
+        <w:rFonts w:ascii="Courier New" w:hAnsi="Courier New" w:cs="Courier New" w:hint="default"/>
+      </w:rPr>
+    </w:lvl>
+    <w:lvl w:ilvl="5" w:tplc="140A0005" w:tentative="1">
+      <w:start w:val="1"/>
+      <w:numFmt w:val="bullet"/>
+      <w:lvlText w:val=""/>
+      <w:lvlJc w:val="left"/>
+      <w:pPr>
+        <w:ind w:left="4320" w:hanging="360"/>
+      </w:pPr>
+      <w:rPr>
+        <w:rFonts w:ascii="Wingdings" w:hAnsi="Wingdings" w:hint="default"/>
+      </w:rPr>
+    </w:lvl>
+    <w:lvl w:ilvl="6" w:tplc="140A0001" w:tentative="1">
+      <w:start w:val="1"/>
+      <w:numFmt w:val="bullet"/>
+      <w:lvlText w:val=""/>
+      <w:lvlJc w:val="left"/>
+      <w:pPr>
+        <w:ind w:left="5040" w:hanging="360"/>
+      </w:pPr>
+      <w:rPr>
+        <w:rFonts w:ascii="Symbol" w:hAnsi="Symbol" w:hint="default"/>
+      </w:rPr>
+    </w:lvl>
+    <w:lvl w:ilvl="7" w:tplc="140A0003" w:tentative="1">
+      <w:start w:val="1"/>
+      <w:numFmt w:val="bullet"/>
+      <w:lvlText w:val="o"/>
+      <w:lvlJc w:val="left"/>
+      <w:pPr>
+        <w:ind w:left="5760" w:hanging="360"/>
+      </w:pPr>
+      <w:rPr>
+        <w:rFonts w:ascii="Courier New" w:hAnsi="Courier New" w:cs="Courier New" w:hint="default"/>
+      </w:rPr>
+    </w:lvl>
+    <w:lvl w:ilvl="8" w:tplc="140A0005" w:tentative="1">
+      <w:start w:val="1"/>
+      <w:numFmt w:val="bullet"/>
+      <w:lvlText w:val=""/>
+      <w:lvlJc w:val="left"/>
+      <w:pPr>
         <w:ind w:left="6480" w:hanging="360"/>
       </w:pPr>
       <w:rPr>
@@ -4328,7 +5071,19 @@
     </w:lvl>
   </w:abstractNum>
   <w:num w:numId="1" w16cid:durableId="1109198902">
+    <w:abstractNumId w:val="1"/>
+  </w:num>
+  <w:num w:numId="2" w16cid:durableId="1327128525">
+    <w:abstractNumId w:val="4"/>
+  </w:num>
+  <w:num w:numId="3" w16cid:durableId="930310312">
+    <w:abstractNumId w:val="3"/>
+  </w:num>
+  <w:num w:numId="4" w16cid:durableId="857813461">
     <w:abstractNumId w:val="0"/>
+  </w:num>
+  <w:num w:numId="5" w16cid:durableId="445009816">
+    <w:abstractNumId w:val="2"/>
   </w:num>
 </w:numbering>
 </file>
@@ -4937,7 +5692,6 @@
   <w:style w:type="character" w:default="1" w:styleId="Fuentedeprrafopredeter">
     <w:name w:val="Default Paragraph Font"/>
     <w:uiPriority w:val="1"/>
-    <w:semiHidden/>
     <w:unhideWhenUsed/>
   </w:style>
   <w:style w:type="table" w:default="1" w:styleId="Tablanormal">
@@ -5270,6 +6024,50 @@
       </w:tblBorders>
     </w:tblPr>
   </w:style>
+  <w:style w:type="paragraph" w:styleId="Encabezado">
+    <w:name w:val="header"/>
+    <w:basedOn w:val="Normal"/>
+    <w:link w:val="EncabezadoCar"/>
+    <w:uiPriority w:val="99"/>
+    <w:unhideWhenUsed/>
+    <w:rsid w:val="000A056C"/>
+    <w:pPr>
+      <w:tabs>
+        <w:tab w:val="center" w:pos="4419"/>
+        <w:tab w:val="right" w:pos="8838"/>
+      </w:tabs>
+      <w:spacing w:after="0" w:line="240" w:lineRule="auto"/>
+    </w:pPr>
+  </w:style>
+  <w:style w:type="character" w:customStyle="1" w:styleId="EncabezadoCar">
+    <w:name w:val="Encabezado Car"/>
+    <w:basedOn w:val="Fuentedeprrafopredeter"/>
+    <w:link w:val="Encabezado"/>
+    <w:uiPriority w:val="99"/>
+    <w:rsid w:val="000A056C"/>
+  </w:style>
+  <w:style w:type="paragraph" w:styleId="Piedepgina">
+    <w:name w:val="footer"/>
+    <w:basedOn w:val="Normal"/>
+    <w:link w:val="PiedepginaCar"/>
+    <w:uiPriority w:val="99"/>
+    <w:unhideWhenUsed/>
+    <w:rsid w:val="000A056C"/>
+    <w:pPr>
+      <w:tabs>
+        <w:tab w:val="center" w:pos="4419"/>
+        <w:tab w:val="right" w:pos="8838"/>
+      </w:tabs>
+      <w:spacing w:after="0" w:line="240" w:lineRule="auto"/>
+    </w:pPr>
+  </w:style>
+  <w:style w:type="character" w:customStyle="1" w:styleId="PiedepginaCar">
+    <w:name w:val="Pie de página Car"/>
+    <w:basedOn w:val="Fuentedeprrafopredeter"/>
+    <w:link w:val="Piedepgina"/>
+    <w:uiPriority w:val="99"/>
+    <w:rsid w:val="000A056C"/>
+  </w:style>
 </w:styles>
 </file>
 

</xml_diff>